<commit_message>
iand complaint: typst and docx on the shared cross-engine layout model; docx/render.sh, make-reference.sh, patch-styles.pl and reference.docx give way to docx/reference.xml (base="xengine", {font} TeX Gyre Termes per data/exemplar-fonts.json, pandoc-from commonmark+smart as typst's cmarker reads quotes); the docx reads <!--UNNUMBERED--> and <!--SIGNATURE--> as typst does (WHEREFORE and the jury demand were numbered, the signature was missing); docx XENG-001..003 pass (225/225 lines), params.cross_engine: gate; eps_v_pt 4.0 for LibreOffice's Termes word boxes (DEF-FORM-002, documented in eval.yaml) (fb-595.68.7)
</commit_message>
<xml_diff>
--- a/courts/eighth-circuit/iowa/federal/northern-district/complaint/usage/OUTPUT-complaint.docx
+++ b/courts/eighth-circuit/iowa/federal/northern-district/complaint/usage/OUTPUT-complaint.docx
@@ -5,6 +5,7 @@
     <w:p>
       <w:pPr>
         <w:spacing w:before="0" w:after="0" w:line="276" w:lineRule="exact"/>
+        <w:ind w:left="0" w:firstLine="0"/>
         <w:jc w:val="center"/>
       </w:pPr>
       <w:r>
@@ -18,6 +19,7 @@
     <w:p>
       <w:pPr>
         <w:spacing w:before="0" w:after="0" w:line="276" w:lineRule="exact"/>
+        <w:ind w:left="0" w:firstLine="0"/>
         <w:jc w:val="center"/>
       </w:pPr>
       <w:r>
@@ -31,6 +33,7 @@
     <w:p>
       <w:pPr>
         <w:spacing w:before="0" w:after="0" w:line="276" w:lineRule="exact"/>
+        <w:ind w:left="0" w:firstLine="0"/>
         <w:jc w:val="center"/>
       </w:pPr>
       <w:r>
@@ -44,6 +47,7 @@
     <w:p>
       <w:pPr>
         <w:spacing w:before="0" w:after="0" w:line="480" w:lineRule="exact"/>
+        <w:ind w:left="0" w:firstLine="0"/>
       </w:pPr>
     </w:p>
     <w:tbl>
@@ -59,9 +63,12 @@
         </w:tblBorders>
         <w:tblLayout w:type="fixed"/>
         <w:tblCellMar>
+          <w:top w:w="0" w:type="dxa"/>
           <w:left w:w="0" w:type="dxa"/>
+          <w:bottom w:w="0" w:type="dxa"/>
           <w:right w:w="0" w:type="dxa"/>
         </w:tblCellMar>
+        <w:tblLook w:val="0000" w:firstRow="0" w:lastRow="0" w:firstColumn="0" w:lastColumn="0" w:noHBand="0" w:noVBand="0"/>
       </w:tblPr>
       <w:tblGrid>
         <w:gridCol w:w="4464"/>
@@ -72,18 +79,59 @@
         <w:tc>
           <w:tcPr>
             <w:tcW w:w="4464" w:type="dxa"/>
+            <w:tcMar>
+              <w:right w:w="144" w:type="dxa"/>
+            </w:tcMar>
           </w:tcPr>
           <w:p>
             <w:pPr>
               <w:spacing w:before="0" w:after="0" w:line="276" w:lineRule="exact"/>
+              <w:ind w:left="0" w:firstLine="0"/>
             </w:pPr>
             <w:r>
-              <w:t xml:space="preserve">IOWA ROTOCAST PLASTICS, INC. d/b/a GRIZZLY COOLERS,</w:t>
+              <w:t xml:space="preserve">IOWA</w:t>
+            </w:r>
+            <w:r>
+              <w:t xml:space="preserve"> </w:t>
+            </w:r>
+            <w:r>
+              <w:t xml:space="preserve">ROTOCAST</w:t>
+            </w:r>
+            <w:r>
+              <w:t xml:space="preserve"> </w:t>
+            </w:r>
+            <w:r>
+              <w:t xml:space="preserve">PLASTICS,</w:t>
+            </w:r>
+            <w:r>
+              <w:t xml:space="preserve"> </w:t>
+            </w:r>
+            <w:r>
+              <w:t xml:space="preserve">INC.</w:t>
+            </w:r>
+            <w:r>
+              <w:t xml:space="preserve"> </w:t>
+            </w:r>
+            <w:r>
+              <w:t xml:space="preserve">d/b/a</w:t>
+            </w:r>
+            <w:r>
+              <w:t xml:space="preserve"> </w:t>
+            </w:r>
+            <w:r>
+              <w:t xml:space="preserve">GRIZZLY</w:t>
+            </w:r>
+            <w:r>
+              <w:t xml:space="preserve"> </w:t>
+            </w:r>
+            <w:r>
+              <w:t xml:space="preserve">COOLERS,</w:t>
             </w:r>
           </w:p>
           <w:p>
             <w:pPr>
               <w:spacing w:before="0" w:after="0" w:line="276" w:lineRule="exact"/>
+              <w:ind w:left="0" w:firstLine="0"/>
             </w:pPr>
             <w:r>
               <w:t xml:space="preserve">Plaintiff,</w:t>
@@ -92,6 +140,7 @@
           <w:p>
             <w:pPr>
               <w:spacing w:before="0" w:after="0" w:line="276" w:lineRule="exact"/>
+              <w:ind w:left="0" w:firstLine="0"/>
             </w:pPr>
             <w:r>
               <w:t xml:space="preserve">v.</w:t>
@@ -100,14 +149,22 @@
           <w:p>
             <w:pPr>
               <w:spacing w:before="0" w:after="0" w:line="276" w:lineRule="exact"/>
+              <w:ind w:left="0" w:firstLine="0"/>
             </w:pPr>
             <w:r>
-              <w:t xml:space="preserve">FUSE, LLC,</w:t>
+              <w:t xml:space="preserve">FUSE,</w:t>
+            </w:r>
+            <w:r>
+              <w:t xml:space="preserve"> </w:t>
+            </w:r>
+            <w:r>
+              <w:t xml:space="preserve">LLC,</w:t>
             </w:r>
           </w:p>
           <w:p>
             <w:pPr>
               <w:spacing w:before="0" w:after="0" w:line="276" w:lineRule="exact"/>
+              <w:ind w:left="0" w:firstLine="0"/>
             </w:pPr>
             <w:r>
               <w:t xml:space="preserve">Defendant.</w:t>
@@ -121,6 +178,7 @@
           <w:p>
             <w:pPr>
               <w:spacing w:before="0" w:after="0" w:line="276" w:lineRule="exact"/>
+              <w:ind w:left="0" w:firstLine="0"/>
             </w:pPr>
             <w:r>
               <w:t xml:space="preserve">)</w:t>
@@ -129,6 +187,7 @@
           <w:p>
             <w:pPr>
               <w:spacing w:before="0" w:after="0" w:line="276" w:lineRule="exact"/>
+              <w:ind w:left="0" w:firstLine="0"/>
             </w:pPr>
             <w:r>
               <w:t xml:space="preserve">)</w:t>
@@ -137,6 +196,7 @@
           <w:p>
             <w:pPr>
               <w:spacing w:before="0" w:after="0" w:line="276" w:lineRule="exact"/>
+              <w:ind w:left="0" w:firstLine="0"/>
             </w:pPr>
             <w:r>
               <w:t xml:space="preserve">)</w:t>
@@ -145,6 +205,7 @@
           <w:p>
             <w:pPr>
               <w:spacing w:before="0" w:after="0" w:line="276" w:lineRule="exact"/>
+              <w:ind w:left="0" w:firstLine="0"/>
             </w:pPr>
             <w:r>
               <w:t xml:space="preserve">)</w:t>
@@ -153,6 +214,7 @@
           <w:p>
             <w:pPr>
               <w:spacing w:before="0" w:after="0" w:line="276" w:lineRule="exact"/>
+              <w:ind w:left="0" w:firstLine="0"/>
             </w:pPr>
             <w:r>
               <w:t xml:space="preserve">)</w:t>
@@ -169,14 +231,18 @@
           <w:p>
             <w:pPr>
               <w:spacing w:before="0" w:after="0" w:line="276" w:lineRule="exact"/>
+              <w:ind w:left="0" w:firstLine="0"/>
             </w:pPr>
             <w:r>
-              <w:t xml:space="preserve">No. 2:26-cv-1019</w:t>
+              <w:t xml:space="preserve">No. 2:26-cv</w:t>
+              <w:noBreakHyphen/>
+              <w:t xml:space="preserve">1019</w:t>
             </w:r>
           </w:p>
           <w:p>
             <w:pPr>
-              <w:spacing w:before="480" w:after="0" w:line="276" w:lineRule="exact"/>
+              <w:spacing w:before="276" w:after="0" w:line="276" w:lineRule="exact"/>
+              <w:ind w:left="0" w:firstLine="0"/>
             </w:pPr>
             <w:r>
               <w:rPr>
@@ -188,7 +254,8 @@
           </w:p>
           <w:p>
             <w:pPr>
-              <w:spacing w:before="120" w:after="0" w:line="276" w:lineRule="exact"/>
+              <w:spacing w:before="0" w:after="0" w:line="276" w:lineRule="exact"/>
+              <w:ind w:left="0" w:firstLine="0"/>
             </w:pPr>
             <w:r>
               <w:rPr>
@@ -204,6 +271,7 @@
     <w:p>
       <w:pPr>
         <w:spacing w:before="0" w:after="0" w:line="480" w:lineRule="exact"/>
+        <w:ind w:left="0" w:firstLine="0"/>
       </w:pPr>
     </w:p>
     <w:p>
@@ -211,7 +279,7 @@
         <w:pStyle w:val="FirstParagraph"/>
       </w:pPr>
       <w:r>
-        <w:t xml:space="preserve">Plaintiff Iowa Rotocast Plastics, Inc. d/b/a Grizzly Coolers (</w:t>
+        <w:t xml:space="preserve">Plaintiff Iowa Rotocast Plastics, Inc. d/b/a Grizzly Coolers (</w:t>
       </w:r>
       <w:r>
         <w:t xml:space="preserve">“Grizzly”</w:t>
@@ -238,7 +306,6 @@
         <w:t xml:space="preserve">) allege, on knowledge as to its own actions and otherwise upon information and belief, as follows:</w:t>
       </w:r>
     </w:p>
-    <w:bookmarkStart w:id="20" w:name="preliminary-statement"/>
     <w:p>
       <w:pPr>
         <w:pStyle w:val="Heading1"/>
@@ -252,19 +319,25 @@
         <w:pStyle w:val="FirstParagraph"/>
       </w:pPr>
       <w:r>
-        <w:t>1.</w:t>
-      </w:r>
-      <w:r>
-        <w:tab/>
-      </w:r>
-      <w:r>
-        <w:t xml:space="preserve">This is an action for declaratory judgment of non-infringement and invalidity of U.S. Patent No. 10,514,164 (“the</w:t>
-      </w:r>
-      <w:r>
-        <w:t xml:space="preserve"> </w:t>
-      </w:r>
-      <w:r>
-        <w:t xml:space="preserve">‘164 Patent”), and for damages arising from FUSE’s unfair competitive conduct. IRP seeks declarations that it does not infringe any valid claim of the ’164 Patent, that the claims of the ’164 Patent are invalid, and further seeks an award of damages, attorneys’</w:t>
+        <w:t xml:space="preserve">1.</w:t>
+      </w:r>
+      <w:r>
+        <w:tab/>
+      </w:r>
+      <w:r>
+        <w:t xml:space="preserve">This is an action for declaratory judgment of non-infringement and invalidity of U.S. Patent No. 10,514,164 (</w:t>
+      </w:r>
+      <w:r>
+        <w:t xml:space="preserve">“the ’164 Patent”</w:t>
+      </w:r>
+      <w:r>
+        <w:t xml:space="preserve">), and for damages arising from FUSE’s unfair competitive conduct. IRP seeks declarations that it does not infringe any valid claim of the ’164 Patent, that the claims of the</w:t>
+      </w:r>
+      <w:r>
+        <w:t xml:space="preserve"> </w:t>
+      </w:r>
+      <w:r>
+        <w:t xml:space="preserve">‘164 Patent are invalid, and further seeks an award of damages, attorneys’</w:t>
       </w:r>
       <w:r>
         <w:t xml:space="preserve"> </w:t>
@@ -273,8 +346,6 @@
         <w:t xml:space="preserve">fees, and such other relief as the Court deems just and proper.</w:t>
       </w:r>
     </w:p>
-    <w:bookmarkEnd w:id="20"/>
-    <w:bookmarkStart w:id="21" w:name="the-parties"/>
     <w:p>
       <w:pPr>
         <w:pStyle w:val="Heading1"/>
@@ -288,7 +359,7 @@
         <w:pStyle w:val="FirstParagraph"/>
       </w:pPr>
       <w:r>
-        <w:t>2.</w:t>
+        <w:t xml:space="preserve">2.</w:t>
       </w:r>
       <w:r>
         <w:tab/>
@@ -302,7 +373,7 @@
         <w:pStyle w:val="BodyText"/>
       </w:pPr>
       <w:r>
-        <w:t>3.</w:t>
+        <w:t xml:space="preserve">3.</w:t>
       </w:r>
       <w:r>
         <w:tab/>
@@ -316,7 +387,7 @@
         <w:pStyle w:val="BodyText"/>
       </w:pPr>
       <w:r>
-        <w:t>4.</w:t>
+        <w:t xml:space="preserve">4.</w:t>
       </w:r>
       <w:r>
         <w:tab/>
@@ -330,7 +401,7 @@
         <w:pStyle w:val="BodyText"/>
       </w:pPr>
       <w:r>
-        <w:t>5.</w:t>
+        <w:t xml:space="preserve">5.</w:t>
       </w:r>
       <w:r>
         <w:tab/>
@@ -339,8 +410,6 @@
         <w:t xml:space="preserve">FUSE purports to develop and license technology in the field of thermally insulated containers and related products</w:t>
       </w:r>
     </w:p>
-    <w:bookmarkEnd w:id="21"/>
-    <w:bookmarkStart w:id="22" w:name="jurisdiction-and-venue"/>
     <w:p>
       <w:pPr>
         <w:pStyle w:val="Heading1"/>
@@ -354,7 +423,7 @@
         <w:pStyle w:val="FirstParagraph"/>
       </w:pPr>
       <w:r>
-        <w:t>6.</w:t>
+        <w:t xml:space="preserve">6.</w:t>
       </w:r>
       <w:r>
         <w:tab/>
@@ -368,7 +437,7 @@
         <w:pStyle w:val="BodyText"/>
       </w:pPr>
       <w:r>
-        <w:t>7.</w:t>
+        <w:t xml:space="preserve">7.</w:t>
       </w:r>
       <w:r>
         <w:tab/>
@@ -382,21 +451,21 @@
         <w:pStyle w:val="BodyText"/>
       </w:pPr>
       <w:r>
-        <w:t>8.</w:t>
-      </w:r>
-      <w:r>
-        <w:tab/>
-      </w:r>
-      <w:r>
-        <w:t xml:space="preserve">This Court has supplemental jurisdiction over Grizzly’s state law claim pursuant to 28 U.S.C. § 1367, as that claim arises from the same nucleus of operative facts as the federal claims.</w:t>
-      </w:r>
-    </w:p>
-    <w:p>
-      <w:pPr>
-        <w:pStyle w:val="BodyText"/>
-      </w:pPr>
-      <w:r>
-        <w:t>9.</w:t>
+        <w:t xml:space="preserve">8.</w:t>
+      </w:r>
+      <w:r>
+        <w:tab/>
+      </w:r>
+      <w:r>
+        <w:t xml:space="preserve">This Court has supplemental jurisdiction over Grizzly’s state law claim pursuant to 28 U.S.C. § 1367, as that claim arises from the same nucleus of operative facts as the federal claims.</w:t>
+      </w:r>
+    </w:p>
+    <w:p>
+      <w:pPr>
+        <w:pStyle w:val="BodyText"/>
+      </w:pPr>
+      <w:r>
+        <w:t xml:space="preserve">9.</w:t>
       </w:r>
       <w:r>
         <w:tab/>
@@ -410,17 +479,15 @@
         <w:pStyle w:val="BodyText"/>
       </w:pPr>
       <w:r>
-        <w:t>10.</w:t>
-      </w:r>
-      <w:r>
-        <w:tab/>
-      </w:r>
-      <w:r>
-        <w:t xml:space="preserve">Venue is proper in this District pursuant to 28 U.S.C. § 1391(b)(1) and (2) because Grizzly resides and has its principal place of business in this District, and a substantial part of the events giving rise to this action occurred in this District.</w:t>
-      </w:r>
-    </w:p>
-    <w:bookmarkEnd w:id="22"/>
-    <w:bookmarkStart w:id="26" w:name="facts"/>
+        <w:t xml:space="preserve">10.</w:t>
+      </w:r>
+      <w:r>
+        <w:tab/>
+      </w:r>
+      <w:r>
+        <w:t xml:space="preserve">Venue is proper in this District pursuant to 28 U.S.C. § 1391(b)⁠(1) and (2) because Grizzly resides and has its principal place of business in this District, and a substantial part of the events giving rise to this action occurred in this District.</w:t>
+      </w:r>
+    </w:p>
     <w:p>
       <w:pPr>
         <w:pStyle w:val="Heading1"/>
@@ -434,7 +501,7 @@
         <w:pStyle w:val="FirstParagraph"/>
       </w:pPr>
       <w:r>
-        <w:t>11.</w:t>
+        <w:t xml:space="preserve">11.</w:t>
       </w:r>
       <w:r>
         <w:tab/>
@@ -448,7 +515,7 @@
         <w:pStyle w:val="BodyText"/>
       </w:pPr>
       <w:r>
-        <w:t>12.</w:t>
+        <w:t xml:space="preserve">12.</w:t>
       </w:r>
       <w:r>
         <w:tab/>
@@ -462,7 +529,7 @@
         <w:pStyle w:val="BodyText"/>
       </w:pPr>
       <w:r>
-        <w:t>13.</w:t>
+        <w:t xml:space="preserve">13.</w:t>
       </w:r>
       <w:r>
         <w:tab/>
@@ -480,15 +547,15 @@
         <w:t xml:space="preserve"> </w:t>
       </w:r>
       <w:r>
-        <w:t xml:space="preserve">that was available by or before November 14, 2014. See also, id at pp. 26, 29</w:t>
-      </w:r>
-    </w:p>
-    <w:p>
-      <w:pPr>
-        <w:pStyle w:val="BodyText"/>
-      </w:pPr>
-      <w:r>
-        <w:t>14.</w:t>
+        <w:t xml:space="preserve">that was available by or before November 14, 2014. See also, id at pp. 26, 29</w:t>
+      </w:r>
+    </w:p>
+    <w:p>
+      <w:pPr>
+        <w:pStyle w:val="BodyText"/>
+      </w:pPr>
+      <w:r>
+        <w:t xml:space="preserve">14.</w:t>
       </w:r>
       <w:r>
         <w:tab/>
@@ -502,7 +569,7 @@
         <w:pStyle w:val="BodyText"/>
       </w:pPr>
       <w:r>
-        <w:t>15.</w:t>
+        <w:t xml:space="preserve">15.</w:t>
       </w:r>
       <w:r>
         <w:tab/>
@@ -528,13 +595,13 @@
         <w:pStyle w:val="BodyText"/>
       </w:pPr>
       <w:r>
-        <w:t>16.</w:t>
-      </w:r>
-      <w:r>
-        <w:tab/>
-      </w:r>
-      <w:r>
-        <w:t xml:space="preserve">The ’164 Patent issued from Application No. 16/364,848 filed on March 26, 2019, as a chain of applications most relevantly tracing to U.S. Patent No. 9,568,186, filed September 23, 2015 (the</w:t>
+        <w:t xml:space="preserve">16.</w:t>
+      </w:r>
+      <w:r>
+        <w:tab/>
+      </w:r>
+      <w:r>
+        <w:t xml:space="preserve">The ’164 Patent issued from Application No. 16/364,848 filed on March 26, 2019, as a chain of applications most relevantly tracing to U.S. Patent No. 9,568,186, filed September 23, 2015 (the</w:t>
       </w:r>
       <w:r>
         <w:t xml:space="preserve"> </w:t>
@@ -551,7 +618,7 @@
         <w:pStyle w:val="BodyText"/>
       </w:pPr>
       <w:r>
-        <w:t>17.</w:t>
+        <w:t xml:space="preserve">17.</w:t>
       </w:r>
       <w:r>
         <w:tab/>
@@ -565,21 +632,21 @@
         <w:pStyle w:val="BodyText"/>
       </w:pPr>
       <w:r>
-        <w:t>18.</w:t>
-      </w:r>
-      <w:r>
-        <w:tab/>
-      </w:r>
-      <w:r>
-        <w:t xml:space="preserve">On information and belief, FUSE’s counsel Stephen S. Ashley, Jr. has confirmed in correspondence dated June 4, 2026, that the opposed channels receiving a temperature altering element were first disclosed in the ’186 Patent filed September 23, 2015. See Exhibit B.</w:t>
-      </w:r>
-    </w:p>
-    <w:p>
-      <w:pPr>
-        <w:pStyle w:val="BodyText"/>
-      </w:pPr>
-      <w:r>
-        <w:t>19.</w:t>
+        <w:t xml:space="preserve">18.</w:t>
+      </w:r>
+      <w:r>
+        <w:tab/>
+      </w:r>
+      <w:r>
+        <w:t xml:space="preserve">On information and belief, FUSE’s counsel Stephen S. Ashley, Jr. has confirmed in correspondence dated June 4, 2026, that the opposed channels receiving a temperature altering element were first disclosed in the ’186 Patent filed September 23, 2015. See Exhibit B.</w:t>
+      </w:r>
+    </w:p>
+    <w:p>
+      <w:pPr>
+        <w:pStyle w:val="BodyText"/>
+      </w:pPr>
+      <w:r>
+        <w:t xml:space="preserve">19.</w:t>
       </w:r>
       <w:r>
         <w:tab/>
@@ -593,7 +660,7 @@
         <w:pStyle w:val="BodyText"/>
       </w:pPr>
       <w:r>
-        <w:t>20.</w:t>
+        <w:t xml:space="preserve">20.</w:t>
       </w:r>
       <w:r>
         <w:tab/>
@@ -607,7 +674,7 @@
         <w:pStyle w:val="BodyText"/>
       </w:pPr>
       <w:r>
-        <w:t>21.</w:t>
+        <w:t xml:space="preserve">21.</w:t>
       </w:r>
       <w:r>
         <w:tab/>
@@ -621,21 +688,21 @@
         <w:pStyle w:val="BodyText"/>
       </w:pPr>
       <w:r>
-        <w:t>22.</w:t>
-      </w:r>
-      <w:r>
-        <w:tab/>
-      </w:r>
-      <w:r>
-        <w:t xml:space="preserve">The May 28 letter demanded that Grizzly immediately cease and desist from making, using, offering for sale, selling, and/or importing the identified products, and further demanded that Grizzly provide a full accounting of gross revenues from sales of the accused products. See id.</w:t>
-      </w:r>
-    </w:p>
-    <w:p>
-      <w:pPr>
-        <w:pStyle w:val="BodyText"/>
-      </w:pPr>
-      <w:r>
-        <w:t>23.</w:t>
+        <w:t xml:space="preserve">22.</w:t>
+      </w:r>
+      <w:r>
+        <w:tab/>
+      </w:r>
+      <w:r>
+        <w:t xml:space="preserve">The May 28 letter demanded that Grizzly immediately cease and desist from making, using, offering for sale, selling, and/​or importing the identified products, and further demanded that Grizzly provide a full accounting of gross revenues from sales of the accused products. See id.</w:t>
+      </w:r>
+    </w:p>
+    <w:p>
+      <w:pPr>
+        <w:pStyle w:val="BodyText"/>
+      </w:pPr>
+      <w:r>
+        <w:t xml:space="preserve">23.</w:t>
       </w:r>
       <w:r>
         <w:tab/>
@@ -649,7 +716,7 @@
         <w:pStyle w:val="BodyText"/>
       </w:pPr>
       <w:r>
-        <w:t>24.</w:t>
+        <w:t xml:space="preserve">24.</w:t>
       </w:r>
       <w:r>
         <w:tab/>
@@ -669,7 +736,7 @@
         <w:pStyle w:val="BodyText"/>
       </w:pPr>
       <w:r>
-        <w:t>25.</w:t>
+        <w:t xml:space="preserve">25.</w:t>
       </w:r>
       <w:r>
         <w:tab/>
@@ -683,7 +750,7 @@
         <w:pStyle w:val="BodyText"/>
       </w:pPr>
       <w:r>
-        <w:t>26.</w:t>
+        <w:t xml:space="preserve">26.</w:t>
       </w:r>
       <w:r>
         <w:tab/>
@@ -697,7 +764,7 @@
         <w:pStyle w:val="BodyText"/>
       </w:pPr>
       <w:r>
-        <w:t>27.</w:t>
+        <w:t xml:space="preserve">27.</w:t>
       </w:r>
       <w:r>
         <w:tab/>
@@ -706,7 +773,6 @@
         <w:t xml:space="preserve">An actual, immediate, and justiciable controversy exists between Grizzly and FUSE regarding the infringement, validity, and enforceability of the ’164 Patent.</w:t>
       </w:r>
     </w:p>
-    <w:bookmarkStart w:id="23" w:name="Xe0068f01b36963435b33f79f5129fff51e6c26b"/>
     <w:p>
       <w:pPr>
         <w:pStyle w:val="Heading2"/>
@@ -720,7 +786,7 @@
         <w:pStyle w:val="FirstParagraph"/>
       </w:pPr>
       <w:r>
-        <w:t>28.</w:t>
+        <w:t xml:space="preserve">28.</w:t>
       </w:r>
       <w:r>
         <w:tab/>
@@ -734,41 +800,41 @@
         <w:pStyle w:val="BodyText"/>
       </w:pPr>
       <w:r>
-        <w:t>29.</w:t>
-      </w:r>
-      <w:r>
-        <w:tab/>
-      </w:r>
-      <w:r>
-        <w:t xml:space="preserve">The claims of the ’164 Patent are invalid for failure to satisfy one or more of the conditions of patentability set forth in 35 U.S.C. §§ 102, and/or 103.</w:t>
-      </w:r>
-    </w:p>
-    <w:p>
-      <w:pPr>
-        <w:pStyle w:val="BodyText"/>
-      </w:pPr>
-      <w:r>
-        <w:t>30.</w:t>
-      </w:r>
-      <w:r>
-        <w:tab/>
-      </w:r>
-      <w:r>
-        <w:t xml:space="preserve">The claims of the ’164 Patent are invalid under 35 U.S.C. § 102 because the claimed invention was in public use, on sale, and otherwise available to the public before the effective filing date of the claimed invention.</w:t>
-      </w:r>
-    </w:p>
-    <w:p>
-      <w:pPr>
-        <w:pStyle w:val="BodyText"/>
-      </w:pPr>
-      <w:r>
-        <w:t>31.</w:t>
-      </w:r>
-      <w:r>
-        <w:tab/>
-      </w:r>
-      <w:r>
-        <w:t xml:space="preserve">Specifically and without limitation, the following prior art, each predating the controlling priority date of September 23, 2015, teaches or suggests, alone or in combination, the channel-and-insert configuration claimed in the ’164 Patent: (a) U.S. Design Patent No. D746,343, titled</w:t>
+        <w:t xml:space="preserve">29.</w:t>
+      </w:r>
+      <w:r>
+        <w:tab/>
+      </w:r>
+      <w:r>
+        <w:t xml:space="preserve">The claims of the ’164 Patent are invalid for failure to satisfy one or more of the conditions of patentability set forth in 35 U.S.C. §§ 102, and/​or 103.</w:t>
+      </w:r>
+    </w:p>
+    <w:p>
+      <w:pPr>
+        <w:pStyle w:val="BodyText"/>
+      </w:pPr>
+      <w:r>
+        <w:t xml:space="preserve">30.</w:t>
+      </w:r>
+      <w:r>
+        <w:tab/>
+      </w:r>
+      <w:r>
+        <w:t xml:space="preserve">The claims of the ’164 Patent are invalid under 35 U.S.C. § 102 because the claimed invention was in public use, on sale, and otherwise available to the public before the effective filing date of the claimed invention.</w:t>
+      </w:r>
+    </w:p>
+    <w:p>
+      <w:pPr>
+        <w:pStyle w:val="BodyText"/>
+      </w:pPr>
+      <w:r>
+        <w:t xml:space="preserve">31.</w:t>
+      </w:r>
+      <w:r>
+        <w:tab/>
+      </w:r>
+      <w:r>
+        <w:t xml:space="preserve">Specifically and without limitation, the following prior art, each predating the controlling priority date of September 23, 2015, teaches or suggests, alone or in combination, the channel-and-insert configuration claimed in the ’164 Patent: (a) U.S. Design Patent No. D746,343, titled</w:t>
       </w:r>
       <w:r>
         <w:t xml:space="preserve"> </w:t>
@@ -780,7 +846,7 @@
         <w:t xml:space="preserve"> </w:t>
       </w:r>
       <w:r>
-        <w:t xml:space="preserve">filed April 4, 2014 by Floyd E. Mount of Decorah, Iowa, covers the ornamental design of the Grizzly IceDivider and constitutes a public disclosure of the IceDivider seventeen months before FUSE’s priority date (Exhibit A, at p. 25); (b) A document titled</w:t>
+        <w:t xml:space="preserve">filed April 4, 2014 by Floyd E. Mount of Decorah, Iowa, covers the ornamental design of the Grizzly IceDivider and constitutes a public disclosure of the IceDivider seventeen months before FUSE’s priority date (Exhibit A, at p. 25); (b) A document titled</w:t>
       </w:r>
       <w:r>
         <w:t xml:space="preserve"> </w:t>
@@ -804,7 +870,7 @@
         <w:t xml:space="preserve"> </w:t>
       </w:r>
       <w:r>
-        <w:t xml:space="preserve">includes a photograph of the Grizzly 75 cooler with the IceDivider inserted in the opposed interior channels, and was published to Grizzly’s blog on July 14, 2014, establishing public disclosure and commercial offering at a major industry trade show more than one year before FUSE’s priority date (Id., at p. 26); (c) A video titled</w:t>
+        <w:t xml:space="preserve">includes a photograph of the Grizzly 75 cooler with the IceDivider inserted in the opposed interior channels, and was published to Grizzly’s blog on July 14, 2014, establishing public disclosure and commercial offering at a major industry trade show more than one year before FUSE’s priority date (Id., at p. 26); (c) A video titled</w:t>
       </w:r>
       <w:r>
         <w:t xml:space="preserve"> </w:t>
@@ -828,7 +894,7 @@
         <w:t xml:space="preserve"> </w:t>
       </w:r>
       <w:r>
-        <w:t xml:space="preserve">(Id., at p. 27); (d) A video titled</w:t>
+        <w:t xml:space="preserve">(Id., at p. 27); (d) A video titled</w:t>
       </w:r>
       <w:r>
         <w:t xml:space="preserve"> </w:t>
@@ -840,43 +906,43 @@
         <w:t xml:space="preserve"> </w:t>
       </w:r>
       <w:r>
-        <w:t xml:space="preserve">published August 25, 2014 by third-party channel Fishhound.com, filmed at ICAST 2014 and identifying IRP in Decorah, Iowa as the manufacturer, publicly discloses the same Grizzly cooler and IceDivider configuration in use (Id., at p. 27); (e) An archived snapshot of the Grizzly Coolers website captured by the Internet Archive’s Wayback Machine on October 2, 2014 shows the Grizzly Frozen Divider listed for sale at $49.99 on IRP’s Parts and Accessories page, establishing commercial availability nearly twelve months before FUSE’s priority date Id., at p. 28); and (f) An archived snapshot of the Grizzly Coolers website captured by the Internet Archive’s Wayback Machine on November 1, 2014 shows the Grizzly Frozen Divider listed for sale at $49.99, in stock, on IRP’s product listing page, establishing continued commercial availability more than one year before FUSE’s priority date Id., at p. 29).</w:t>
-      </w:r>
-    </w:p>
-    <w:p>
-      <w:pPr>
-        <w:pStyle w:val="BodyText"/>
-      </w:pPr>
-      <w:r>
-        <w:t>32.</w:t>
-      </w:r>
-      <w:r>
-        <w:tab/>
-      </w:r>
-      <w:r>
-        <w:t xml:space="preserve">Each of the prior art references identified in the above subparagraphs predate the September 23, 2015 priority date of the ’164 Patent, independently or in combination triggering the on-sale and public use bars of 35 U.S.C. § 102(a)(1).</w:t>
-      </w:r>
-    </w:p>
-    <w:p>
-      <w:pPr>
-        <w:pStyle w:val="BodyText"/>
-      </w:pPr>
-      <w:r>
-        <w:t>33.</w:t>
-      </w:r>
-      <w:r>
-        <w:tab/>
-      </w:r>
-      <w:r>
-        <w:t xml:space="preserve">The claims of the ’164 Patent are further invalid under 35 U.S.C. § 103 to the extent any individual element of the claimed invention was not anticipated, as the differences between the claimed invention and the prior art as a whole would have been obvious to a person of ordinary skill in the art at the time of the claimed invention.</w:t>
-      </w:r>
-    </w:p>
-    <w:p>
-      <w:pPr>
-        <w:pStyle w:val="BodyText"/>
-      </w:pPr>
-      <w:r>
-        <w:t>34.</w:t>
+        <w:t xml:space="preserve">published August 25, 2014 by third-party channel Fishhound.com, filmed at ICAST 2014 and identifying IRP in Decorah, Iowa as the manufacturer, publicly discloses the same Grizzly cooler and IceDivider configuration in use (Id., at p. 27); (e) An archived snapshot of the Grizzly Coolers website captured by the Internet Archive’s Wayback Machine on October 2, 2014 shows the Grizzly Frozen Divider listed for sale at $49.99 on IRP’s Parts and Accessories page, establishing commercial availability nearly twelve months before FUSE’s priority date Id., at p. 28); and (f) An archived snapshot of the Grizzly Coolers website captured by the Internet Archive’s Wayback Machine on November 1, 2014 shows the Grizzly Frozen Divider listed for sale at $49.99, in stock, on IRP’s product listing page, establishing continued commercial availability more than one year before FUSE’s priority date Id., at p. 29).</w:t>
+      </w:r>
+    </w:p>
+    <w:p>
+      <w:pPr>
+        <w:pStyle w:val="BodyText"/>
+      </w:pPr>
+      <w:r>
+        <w:t xml:space="preserve">32.</w:t>
+      </w:r>
+      <w:r>
+        <w:tab/>
+      </w:r>
+      <w:r>
+        <w:t xml:space="preserve">Each of the prior art references identified in the above subparagraphs predate the September 23, 2015 priority date of the ’164 Patent, independently or in combination triggering the on-sale and public use bars of 35 U.S.C. § 102(a)⁠(1).</w:t>
+      </w:r>
+    </w:p>
+    <w:p>
+      <w:pPr>
+        <w:pStyle w:val="BodyText"/>
+      </w:pPr>
+      <w:r>
+        <w:t xml:space="preserve">33.</w:t>
+      </w:r>
+      <w:r>
+        <w:tab/>
+      </w:r>
+      <w:r>
+        <w:t xml:space="preserve">The claims of the ’164 Patent are further invalid under 35 U.S.C. § 103 to the extent any individual element of the claimed invention was not anticipated, as the differences between the claimed invention and the prior art as a whole would have been obvious to a person of ordinary skill in the art at the time of the claimed invention.</w:t>
+      </w:r>
+    </w:p>
+    <w:p>
+      <w:pPr>
+        <w:pStyle w:val="BodyText"/>
+      </w:pPr>
+      <w:r>
+        <w:t xml:space="preserve">34.</w:t>
       </w:r>
       <w:r>
         <w:tab/>
@@ -885,8 +951,6 @@
         <w:t xml:space="preserve">By reason of the foregoing, IRP is entitled to a declaratory judgment that the claims of the ’164 Patent are invalid.</w:t>
       </w:r>
     </w:p>
-    <w:bookmarkEnd w:id="23"/>
-    <w:bookmarkStart w:id="24" w:name="X62b8aa3b272556b1c050d4ff165fab276d38fae"/>
     <w:p>
       <w:pPr>
         <w:pStyle w:val="Heading2"/>
@@ -900,7 +964,7 @@
         <w:pStyle w:val="FirstParagraph"/>
       </w:pPr>
       <w:r>
-        <w:t>35.</w:t>
+        <w:t xml:space="preserve">35.</w:t>
       </w:r>
       <w:r>
         <w:tab/>
@@ -914,7 +978,7 @@
         <w:pStyle w:val="BodyText"/>
       </w:pPr>
       <w:r>
-        <w:t>36.</w:t>
+        <w:t xml:space="preserve">36.</w:t>
       </w:r>
       <w:r>
         <w:tab/>
@@ -928,7 +992,7 @@
         <w:pStyle w:val="BodyText"/>
       </w:pPr>
       <w:r>
-        <w:t>37.</w:t>
+        <w:t xml:space="preserve">37.</w:t>
       </w:r>
       <w:r>
         <w:tab/>
@@ -942,7 +1006,7 @@
         <w:pStyle w:val="BodyText"/>
       </w:pPr>
       <w:r>
-        <w:t>38.</w:t>
+        <w:t xml:space="preserve">38.</w:t>
       </w:r>
       <w:r>
         <w:tab/>
@@ -951,8 +1015,6 @@
         <w:t xml:space="preserve">By reason of the foregoing, Grizzly is entitled to a declaratory judgment that it does not infringe, directly or indirectly, any valid and enforceable claim of the ’164 Patent.</w:t>
       </w:r>
     </w:p>
-    <w:bookmarkEnd w:id="24"/>
-    <w:bookmarkStart w:id="25" w:name="count-iii-unfair-competition"/>
     <w:p>
       <w:pPr>
         <w:pStyle w:val="Heading2"/>
@@ -966,7 +1028,7 @@
         <w:pStyle w:val="FirstParagraph"/>
       </w:pPr>
       <w:r>
-        <w:t>39.</w:t>
+        <w:t xml:space="preserve">39.</w:t>
       </w:r>
       <w:r>
         <w:tab/>
@@ -980,7 +1042,7 @@
         <w:pStyle w:val="BodyText"/>
       </w:pPr>
       <w:r>
-        <w:t>40.</w:t>
+        <w:t xml:space="preserve">40.</w:t>
       </w:r>
       <w:r>
         <w:tab/>
@@ -994,7 +1056,7 @@
         <w:pStyle w:val="BodyText"/>
       </w:pPr>
       <w:r>
-        <w:t>41.</w:t>
+        <w:t xml:space="preserve">41.</w:t>
       </w:r>
       <w:r>
         <w:tab/>
@@ -1008,7 +1070,7 @@
         <w:pStyle w:val="BodyText"/>
       </w:pPr>
       <w:r>
-        <w:t>42.</w:t>
+        <w:t xml:space="preserve">42.</w:t>
       </w:r>
       <w:r>
         <w:tab/>
@@ -1022,7 +1084,7 @@
         <w:pStyle w:val="BodyText"/>
       </w:pPr>
       <w:r>
-        <w:t>43.</w:t>
+        <w:t xml:space="preserve">43.</w:t>
       </w:r>
       <w:r>
         <w:tab/>
@@ -1036,7 +1098,7 @@
         <w:pStyle w:val="BodyText"/>
       </w:pPr>
       <w:r>
-        <w:t>44.</w:t>
+        <w:t xml:space="preserve">44.</w:t>
       </w:r>
       <w:r>
         <w:tab/>
@@ -1050,7 +1112,7 @@
         <w:pStyle w:val="BodyText"/>
       </w:pPr>
       <w:r>
-        <w:t>45.</w:t>
+        <w:t xml:space="preserve">45.</w:t>
       </w:r>
       <w:r>
         <w:tab/>
@@ -1064,7 +1126,7 @@
         <w:pStyle w:val="BodyText"/>
       </w:pPr>
       <w:r>
-        <w:t>46.</w:t>
+        <w:t xml:space="preserve">46.</w:t>
       </w:r>
       <w:r>
         <w:tab/>
@@ -1078,7 +1140,7 @@
         <w:pStyle w:val="BodyText"/>
       </w:pPr>
       <w:r>
-        <w:t>47.</w:t>
+        <w:t xml:space="preserve">47.</w:t>
       </w:r>
       <w:r>
         <w:tab/>
@@ -1092,7 +1154,7 @@
         <w:pStyle w:val="BodyText"/>
       </w:pPr>
       <w:r>
-        <w:t>48.</w:t>
+        <w:t xml:space="preserve">48.</w:t>
       </w:r>
       <w:r>
         <w:tab/>
@@ -1101,9 +1163,6 @@
         <w:t xml:space="preserve">By reason of the foregoing, IRP is entitled to an award of compensatory damages, and, given the willful and deliberate nature of FUSE’s conduct, punitive damages in an amount to be determined by the jury at trial.</w:t>
       </w:r>
     </w:p>
-    <w:bookmarkEnd w:id="25"/>
-    <w:bookmarkEnd w:id="26"/>
-    <w:bookmarkStart w:id="27" w:name="prayer-for-relief"/>
     <w:p>
       <w:pPr>
         <w:pStyle w:val="Heading1"/>
@@ -1117,119 +1176,732 @@
         <w:pStyle w:val="FirstParagraph"/>
       </w:pPr>
       <w:r>
-        <w:t xml:space="preserve">WHEREFORE, Plaintiff Iowa Rotocast Plastics, Inc. respectfully requests that this Court enter judgment in its favor and against Defendant FUSE, LLC as follows:</w:t>
-      </w:r>
-    </w:p>
-    <w:p>
-      <w:pPr>
-        <w:spacing w:before="0" w:after="0" w:line="162" w:lineRule="exact"/>
-      </w:pPr>
+        <w:t xml:space="preserve">WHEREFORE, Plaintiff Iowa Rotocast Plastics, Inc. respectfully requests that this Court enter judgment in its favor and against Defendant FUSE, LLC as follows:</w:t>
+      </w:r>
     </w:p>
     <w:p>
       <w:pPr>
         <w:pStyle w:val="ListItem"/>
-      </w:pPr>
-      <w:r>
-        <w:t>A.</w:t>
-      </w:r>
-      <w:r>
-        <w:tab/>
-      </w:r>
-      <w:r>
-        <w:t xml:space="preserve">A declaration that the claims of U.S. Patent No. 10,514,164 are invalid;</w:t>
+        <w:spacing w:before="162" w:after="0" w:line="480" w:lineRule="exact"/>
+      </w:pPr>
+      <w:r>
+        <w:t xml:space="preserve">A.</w:t>
+      </w:r>
+      <w:r>
+        <w:tab/>
+      </w:r>
+      <w:r>
+        <w:t xml:space="preserve">A</w:t>
+      </w:r>
+      <w:r>
+        <w:t xml:space="preserve"> </w:t>
+      </w:r>
+      <w:r>
+        <w:t xml:space="preserve">declaration</w:t>
+      </w:r>
+      <w:r>
+        <w:t xml:space="preserve"> </w:t>
+      </w:r>
+      <w:r>
+        <w:t xml:space="preserve">that</w:t>
+      </w:r>
+      <w:r>
+        <w:t xml:space="preserve"> </w:t>
+      </w:r>
+      <w:r>
+        <w:t xml:space="preserve">the</w:t>
+      </w:r>
+      <w:r>
+        <w:t xml:space="preserve"> </w:t>
+      </w:r>
+      <w:r>
+        <w:t xml:space="preserve">claims</w:t>
+      </w:r>
+      <w:r>
+        <w:t xml:space="preserve"> </w:t>
+      </w:r>
+      <w:r>
+        <w:t xml:space="preserve">of</w:t>
+      </w:r>
+      <w:r>
+        <w:t xml:space="preserve"> </w:t>
+      </w:r>
+      <w:r>
+        <w:t xml:space="preserve">U.S.</w:t>
+      </w:r>
+      <w:r>
+        <w:t xml:space="preserve"> </w:t>
+      </w:r>
+      <w:r>
+        <w:t xml:space="preserve">Patent</w:t>
+      </w:r>
+      <w:r>
+        <w:t xml:space="preserve"> </w:t>
+      </w:r>
+      <w:r>
+        <w:t xml:space="preserve">No.</w:t>
+      </w:r>
+      <w:r>
+        <w:t xml:space="preserve"> </w:t>
+      </w:r>
+      <w:r>
+        <w:t xml:space="preserve">10,514,164</w:t>
+      </w:r>
+      <w:r>
+        <w:t xml:space="preserve"> </w:t>
+      </w:r>
+      <w:r>
+        <w:t xml:space="preserve">are</w:t>
+      </w:r>
+      <w:r>
+        <w:t xml:space="preserve"> </w:t>
+      </w:r>
+      <w:r>
+        <w:t xml:space="preserve">invalid;</w:t>
       </w:r>
     </w:p>
     <w:p>
       <w:pPr>
         <w:pStyle w:val="ListItem"/>
-      </w:pPr>
-      <w:r>
-        <w:t>B.</w:t>
-      </w:r>
-      <w:r>
-        <w:tab/>
-      </w:r>
-      <w:r>
-        <w:t xml:space="preserve">A declaration that Grizzly does not infringe, directly or indirectly, any valid and enforceable claim of U.S. Patent No. 10,514,164;</w:t>
+        <w:spacing w:before="0" w:after="0" w:line="480" w:lineRule="exact"/>
+      </w:pPr>
+      <w:r>
+        <w:t xml:space="preserve">B.</w:t>
+      </w:r>
+      <w:r>
+        <w:tab/>
+      </w:r>
+      <w:r>
+        <w:t xml:space="preserve">A</w:t>
+      </w:r>
+      <w:r>
+        <w:t xml:space="preserve"> </w:t>
+      </w:r>
+      <w:r>
+        <w:t xml:space="preserve">declaration</w:t>
+      </w:r>
+      <w:r>
+        <w:t xml:space="preserve"> </w:t>
+      </w:r>
+      <w:r>
+        <w:t xml:space="preserve">that</w:t>
+      </w:r>
+      <w:r>
+        <w:t xml:space="preserve"> </w:t>
+      </w:r>
+      <w:r>
+        <w:t xml:space="preserve">Grizzly</w:t>
+      </w:r>
+      <w:r>
+        <w:t xml:space="preserve"> </w:t>
+      </w:r>
+      <w:r>
+        <w:t xml:space="preserve">does</w:t>
+      </w:r>
+      <w:r>
+        <w:t xml:space="preserve"> </w:t>
+      </w:r>
+      <w:r>
+        <w:t xml:space="preserve">not</w:t>
+      </w:r>
+      <w:r>
+        <w:t xml:space="preserve"> </w:t>
+      </w:r>
+      <w:r>
+        <w:t xml:space="preserve">infringe,</w:t>
+      </w:r>
+      <w:r>
+        <w:t xml:space="preserve"> </w:t>
+      </w:r>
+      <w:r>
+        <w:t xml:space="preserve">directly</w:t>
+      </w:r>
+      <w:r>
+        <w:t xml:space="preserve"> </w:t>
+      </w:r>
+      <w:r>
+        <w:t xml:space="preserve">or</w:t>
+      </w:r>
+      <w:r>
+        <w:t xml:space="preserve"> </w:t>
+      </w:r>
+      <w:r>
+        <w:t xml:space="preserve">indirectly,</w:t>
+      </w:r>
+      <w:r>
+        <w:t xml:space="preserve"> </w:t>
+      </w:r>
+      <w:r>
+        <w:t xml:space="preserve">any</w:t>
+      </w:r>
+      <w:r>
+        <w:t xml:space="preserve"> </w:t>
+      </w:r>
+      <w:r>
+        <w:t xml:space="preserve">valid</w:t>
+      </w:r>
+      <w:r>
+        <w:t xml:space="preserve"> </w:t>
+      </w:r>
+      <w:r>
+        <w:t xml:space="preserve">and</w:t>
+      </w:r>
+      <w:r>
+        <w:t xml:space="preserve"> </w:t>
+      </w:r>
+      <w:r>
+        <w:t xml:space="preserve">enforceable</w:t>
+      </w:r>
+      <w:r>
+        <w:t xml:space="preserve"> </w:t>
+      </w:r>
+      <w:r>
+        <w:t xml:space="preserve">claim</w:t>
+      </w:r>
+      <w:r>
+        <w:t xml:space="preserve"> </w:t>
+      </w:r>
+      <w:r>
+        <w:t xml:space="preserve">of</w:t>
+      </w:r>
+      <w:r>
+        <w:t xml:space="preserve"> </w:t>
+      </w:r>
+      <w:r>
+        <w:t xml:space="preserve">U.S.</w:t>
+      </w:r>
+      <w:r>
+        <w:t xml:space="preserve"> </w:t>
+      </w:r>
+      <w:r>
+        <w:t xml:space="preserve">Patent</w:t>
+      </w:r>
+      <w:r>
+        <w:t xml:space="preserve"> </w:t>
+      </w:r>
+      <w:r>
+        <w:t xml:space="preserve">No.</w:t>
+      </w:r>
+      <w:r>
+        <w:t xml:space="preserve"> </w:t>
+      </w:r>
+      <w:r>
+        <w:t xml:space="preserve">10,514,164;</w:t>
       </w:r>
     </w:p>
     <w:p>
       <w:pPr>
         <w:pStyle w:val="ListItem"/>
-      </w:pPr>
-      <w:r>
-        <w:t>C.</w:t>
-      </w:r>
-      <w:r>
-        <w:tab/>
-      </w:r>
-      <w:r>
-        <w:t xml:space="preserve">A permanent injunction prohibiting FUSE from asserting U.S. Patent No. 10,514,164 against Grizzly or any of its products;</w:t>
+        <w:spacing w:before="0" w:after="0" w:line="480" w:lineRule="exact"/>
+      </w:pPr>
+      <w:r>
+        <w:t xml:space="preserve">C.</w:t>
+      </w:r>
+      <w:r>
+        <w:tab/>
+      </w:r>
+      <w:r>
+        <w:t xml:space="preserve">A</w:t>
+      </w:r>
+      <w:r>
+        <w:t xml:space="preserve"> </w:t>
+      </w:r>
+      <w:r>
+        <w:t xml:space="preserve">permanent</w:t>
+      </w:r>
+      <w:r>
+        <w:t xml:space="preserve"> </w:t>
+      </w:r>
+      <w:r>
+        <w:t xml:space="preserve">injunction</w:t>
+      </w:r>
+      <w:r>
+        <w:t xml:space="preserve"> </w:t>
+      </w:r>
+      <w:r>
+        <w:t xml:space="preserve">prohibiting</w:t>
+      </w:r>
+      <w:r>
+        <w:t xml:space="preserve"> </w:t>
+      </w:r>
+      <w:r>
+        <w:t xml:space="preserve">FUSE</w:t>
+      </w:r>
+      <w:r>
+        <w:t xml:space="preserve"> </w:t>
+      </w:r>
+      <w:r>
+        <w:t xml:space="preserve">from</w:t>
+      </w:r>
+      <w:r>
+        <w:t xml:space="preserve"> </w:t>
+      </w:r>
+      <w:r>
+        <w:t xml:space="preserve">asserting</w:t>
+      </w:r>
+      <w:r>
+        <w:t xml:space="preserve"> </w:t>
+      </w:r>
+      <w:r>
+        <w:t xml:space="preserve">U.S.</w:t>
+      </w:r>
+      <w:r>
+        <w:t xml:space="preserve"> </w:t>
+      </w:r>
+      <w:r>
+        <w:t xml:space="preserve">Patent</w:t>
+      </w:r>
+      <w:r>
+        <w:t xml:space="preserve"> </w:t>
+      </w:r>
+      <w:r>
+        <w:t xml:space="preserve">No.</w:t>
+      </w:r>
+      <w:r>
+        <w:t xml:space="preserve"> </w:t>
+      </w:r>
+      <w:r>
+        <w:t xml:space="preserve">10,514,164</w:t>
+      </w:r>
+      <w:r>
+        <w:t xml:space="preserve"> </w:t>
+      </w:r>
+      <w:r>
+        <w:t xml:space="preserve">against</w:t>
+      </w:r>
+      <w:r>
+        <w:t xml:space="preserve"> </w:t>
+      </w:r>
+      <w:r>
+        <w:t xml:space="preserve">Grizzly</w:t>
+      </w:r>
+      <w:r>
+        <w:t xml:space="preserve"> </w:t>
+      </w:r>
+      <w:r>
+        <w:t xml:space="preserve">or</w:t>
+      </w:r>
+      <w:r>
+        <w:t xml:space="preserve"> </w:t>
+      </w:r>
+      <w:r>
+        <w:t xml:space="preserve">any</w:t>
+      </w:r>
+      <w:r>
+        <w:t xml:space="preserve"> </w:t>
+      </w:r>
+      <w:r>
+        <w:t xml:space="preserve">of</w:t>
+      </w:r>
+      <w:r>
+        <w:t xml:space="preserve"> </w:t>
+      </w:r>
+      <w:r>
+        <w:t xml:space="preserve">its</w:t>
+      </w:r>
+      <w:r>
+        <w:t xml:space="preserve"> </w:t>
+      </w:r>
+      <w:r>
+        <w:t xml:space="preserve">products;</w:t>
       </w:r>
     </w:p>
     <w:p>
       <w:pPr>
         <w:pStyle w:val="ListItem"/>
-      </w:pPr>
-      <w:r>
-        <w:t>D.</w:t>
-      </w:r>
-      <w:r>
-        <w:tab/>
-      </w:r>
-      <w:r>
-        <w:t xml:space="preserve">An award of IRP’s damages caused by FUSE’s unfair competition;</w:t>
+        <w:spacing w:before="0" w:after="0" w:line="480" w:lineRule="exact"/>
+      </w:pPr>
+      <w:r>
+        <w:t xml:space="preserve">D.</w:t>
+      </w:r>
+      <w:r>
+        <w:tab/>
+      </w:r>
+      <w:r>
+        <w:t xml:space="preserve">An</w:t>
+      </w:r>
+      <w:r>
+        <w:t xml:space="preserve"> </w:t>
+      </w:r>
+      <w:r>
+        <w:t xml:space="preserve">award</w:t>
+      </w:r>
+      <w:r>
+        <w:t xml:space="preserve"> </w:t>
+      </w:r>
+      <w:r>
+        <w:t xml:space="preserve">of</w:t>
+      </w:r>
+      <w:r>
+        <w:t xml:space="preserve"> </w:t>
+      </w:r>
+      <w:r>
+        <w:t xml:space="preserve">IRP’s</w:t>
+      </w:r>
+      <w:r>
+        <w:t xml:space="preserve"> </w:t>
+      </w:r>
+      <w:r>
+        <w:t xml:space="preserve">damages</w:t>
+      </w:r>
+      <w:r>
+        <w:t xml:space="preserve"> </w:t>
+      </w:r>
+      <w:r>
+        <w:t xml:space="preserve">caused</w:t>
+      </w:r>
+      <w:r>
+        <w:t xml:space="preserve"> </w:t>
+      </w:r>
+      <w:r>
+        <w:t xml:space="preserve">by</w:t>
+      </w:r>
+      <w:r>
+        <w:t xml:space="preserve"> </w:t>
+      </w:r>
+      <w:r>
+        <w:t xml:space="preserve">FUSE’s</w:t>
+      </w:r>
+      <w:r>
+        <w:t xml:space="preserve"> </w:t>
+      </w:r>
+      <w:r>
+        <w:t xml:space="preserve">unfair</w:t>
+      </w:r>
+      <w:r>
+        <w:t xml:space="preserve"> </w:t>
+      </w:r>
+      <w:r>
+        <w:t xml:space="preserve">competition;</w:t>
       </w:r>
     </w:p>
     <w:p>
       <w:pPr>
         <w:pStyle w:val="ListItem"/>
-      </w:pPr>
-      <w:r>
-        <w:t>E.</w:t>
-      </w:r>
-      <w:r>
-        <w:tab/>
-      </w:r>
-      <w:r>
-        <w:t xml:space="preserve">An award of punitive damages arising from FUSE’s willful and deliberate unfair competitive conduct;</w:t>
+        <w:spacing w:before="0" w:after="0" w:line="480" w:lineRule="exact"/>
+      </w:pPr>
+      <w:r>
+        <w:t xml:space="preserve">E.</w:t>
+      </w:r>
+      <w:r>
+        <w:tab/>
+      </w:r>
+      <w:r>
+        <w:t xml:space="preserve">An</w:t>
+      </w:r>
+      <w:r>
+        <w:t xml:space="preserve"> </w:t>
+      </w:r>
+      <w:r>
+        <w:t xml:space="preserve">award</w:t>
+      </w:r>
+      <w:r>
+        <w:t xml:space="preserve"> </w:t>
+      </w:r>
+      <w:r>
+        <w:t xml:space="preserve">of</w:t>
+      </w:r>
+      <w:r>
+        <w:t xml:space="preserve"> </w:t>
+      </w:r>
+      <w:r>
+        <w:t xml:space="preserve">punitive</w:t>
+      </w:r>
+      <w:r>
+        <w:t xml:space="preserve"> </w:t>
+      </w:r>
+      <w:r>
+        <w:t xml:space="preserve">damages</w:t>
+      </w:r>
+      <w:r>
+        <w:t xml:space="preserve"> </w:t>
+      </w:r>
+      <w:r>
+        <w:t xml:space="preserve">arising</w:t>
+      </w:r>
+      <w:r>
+        <w:t xml:space="preserve"> </w:t>
+      </w:r>
+      <w:r>
+        <w:t xml:space="preserve">from</w:t>
+      </w:r>
+      <w:r>
+        <w:t xml:space="preserve"> </w:t>
+      </w:r>
+      <w:r>
+        <w:t xml:space="preserve">FUSE’s</w:t>
+      </w:r>
+      <w:r>
+        <w:t xml:space="preserve"> </w:t>
+      </w:r>
+      <w:r>
+        <w:t xml:space="preserve">willful</w:t>
+      </w:r>
+      <w:r>
+        <w:t xml:space="preserve"> </w:t>
+      </w:r>
+      <w:r>
+        <w:t xml:space="preserve">and</w:t>
+      </w:r>
+      <w:r>
+        <w:t xml:space="preserve"> </w:t>
+      </w:r>
+      <w:r>
+        <w:t xml:space="preserve">deliberate</w:t>
+      </w:r>
+      <w:r>
+        <w:t xml:space="preserve"> </w:t>
+      </w:r>
+      <w:r>
+        <w:t xml:space="preserve">unfair</w:t>
+      </w:r>
+      <w:r>
+        <w:t xml:space="preserve"> </w:t>
+      </w:r>
+      <w:r>
+        <w:t xml:space="preserve">competitive</w:t>
+      </w:r>
+      <w:r>
+        <w:t xml:space="preserve"> </w:t>
+      </w:r>
+      <w:r>
+        <w:t xml:space="preserve">conduct;</w:t>
       </w:r>
     </w:p>
     <w:p>
       <w:pPr>
         <w:pStyle w:val="ListItem"/>
-      </w:pPr>
-      <w:r>
-        <w:t>F.</w:t>
-      </w:r>
-      <w:r>
-        <w:tab/>
-      </w:r>
-      <w:r>
-        <w:t xml:space="preserve">A finding that this is an exceptional case under 35 U.S.C. § 285 and an award of Grizzly’s reasonable attorneys’ fees and costs; and</w:t>
+        <w:spacing w:before="0" w:after="0" w:line="480" w:lineRule="exact"/>
+      </w:pPr>
+      <w:r>
+        <w:t xml:space="preserve">F.</w:t>
+      </w:r>
+      <w:r>
+        <w:tab/>
+      </w:r>
+      <w:r>
+        <w:t xml:space="preserve">A</w:t>
+      </w:r>
+      <w:r>
+        <w:t xml:space="preserve"> </w:t>
+      </w:r>
+      <w:r>
+        <w:t xml:space="preserve">finding</w:t>
+      </w:r>
+      <w:r>
+        <w:t xml:space="preserve"> </w:t>
+      </w:r>
+      <w:r>
+        <w:t xml:space="preserve">that</w:t>
+      </w:r>
+      <w:r>
+        <w:t xml:space="preserve"> </w:t>
+      </w:r>
+      <w:r>
+        <w:t xml:space="preserve">this</w:t>
+      </w:r>
+      <w:r>
+        <w:t xml:space="preserve"> </w:t>
+      </w:r>
+      <w:r>
+        <w:t xml:space="preserve">is</w:t>
+      </w:r>
+      <w:r>
+        <w:t xml:space="preserve"> </w:t>
+      </w:r>
+      <w:r>
+        <w:t xml:space="preserve">an</w:t>
+      </w:r>
+      <w:r>
+        <w:t xml:space="preserve"> </w:t>
+      </w:r>
+      <w:r>
+        <w:t xml:space="preserve">exceptional</w:t>
+      </w:r>
+      <w:r>
+        <w:t xml:space="preserve"> </w:t>
+      </w:r>
+      <w:r>
+        <w:t xml:space="preserve">case</w:t>
+      </w:r>
+      <w:r>
+        <w:t xml:space="preserve"> </w:t>
+      </w:r>
+      <w:r>
+        <w:t xml:space="preserve">under</w:t>
+      </w:r>
+      <w:r>
+        <w:t xml:space="preserve"> </w:t>
+      </w:r>
+      <w:r>
+        <w:t xml:space="preserve">35</w:t>
+      </w:r>
+      <w:r>
+        <w:t xml:space="preserve"> </w:t>
+      </w:r>
+      <w:r>
+        <w:t xml:space="preserve">U.S.C.</w:t>
+      </w:r>
+      <w:r>
+        <w:t xml:space="preserve"> </w:t>
+      </w:r>
+      <w:r>
+        <w:t xml:space="preserve">§</w:t>
+      </w:r>
+      <w:r>
+        <w:t xml:space="preserve"> </w:t>
+      </w:r>
+      <w:r>
+        <w:t xml:space="preserve">285</w:t>
+      </w:r>
+      <w:r>
+        <w:t xml:space="preserve"> </w:t>
+      </w:r>
+      <w:r>
+        <w:t xml:space="preserve">and</w:t>
+      </w:r>
+      <w:r>
+        <w:t xml:space="preserve"> </w:t>
+      </w:r>
+      <w:r>
+        <w:t xml:space="preserve">an</w:t>
+      </w:r>
+      <w:r>
+        <w:t xml:space="preserve"> </w:t>
+      </w:r>
+      <w:r>
+        <w:t xml:space="preserve">award</w:t>
+      </w:r>
+      <w:r>
+        <w:t xml:space="preserve"> </w:t>
+      </w:r>
+      <w:r>
+        <w:t xml:space="preserve">of</w:t>
+      </w:r>
+      <w:r>
+        <w:t xml:space="preserve"> </w:t>
+      </w:r>
+      <w:r>
+        <w:t xml:space="preserve">Grizzly’s</w:t>
+      </w:r>
+      <w:r>
+        <w:t xml:space="preserve"> </w:t>
+      </w:r>
+      <w:r>
+        <w:t xml:space="preserve">reasonable</w:t>
+      </w:r>
+      <w:r>
+        <w:t xml:space="preserve"> </w:t>
+      </w:r>
+      <w:r>
+        <w:t xml:space="preserve">attorneys’</w:t>
+      </w:r>
+      <w:r>
+        <w:t xml:space="preserve"> </w:t>
+      </w:r>
+      <w:r>
+        <w:t xml:space="preserve">fees</w:t>
+      </w:r>
+      <w:r>
+        <w:t xml:space="preserve"> </w:t>
+      </w:r>
+      <w:r>
+        <w:t xml:space="preserve">and</w:t>
+      </w:r>
+      <w:r>
+        <w:t xml:space="preserve"> </w:t>
+      </w:r>
+      <w:r>
+        <w:t xml:space="preserve">costs;</w:t>
+      </w:r>
+      <w:r>
+        <w:t xml:space="preserve"> </w:t>
+      </w:r>
+      <w:r>
+        <w:t xml:space="preserve">and</w:t>
       </w:r>
     </w:p>
     <w:p>
       <w:pPr>
         <w:pStyle w:val="ListItem"/>
-      </w:pPr>
-      <w:r>
-        <w:t>G.</w:t>
-      </w:r>
-      <w:r>
-        <w:tab/>
-      </w:r>
-      <w:r>
-        <w:t xml:space="preserve">Such other and further relief as the Court deems just and proper.</w:t>
-      </w:r>
-    </w:p>
-    <w:p>
-      <w:pPr>
-        <w:spacing w:before="0" w:after="0" w:line="162" w:lineRule="exact"/>
-      </w:pPr>
-    </w:p>
-    <w:bookmarkEnd w:id="27"/>
-    <w:bookmarkStart w:id="28" w:name="jury-demand"/>
+        <w:spacing w:before="0" w:after="162" w:line="480" w:lineRule="exact"/>
+      </w:pPr>
+      <w:r>
+        <w:t xml:space="preserve">G.</w:t>
+      </w:r>
+      <w:r>
+        <w:tab/>
+      </w:r>
+      <w:r>
+        <w:t xml:space="preserve">Such</w:t>
+      </w:r>
+      <w:r>
+        <w:t xml:space="preserve"> </w:t>
+      </w:r>
+      <w:r>
+        <w:t xml:space="preserve">other</w:t>
+      </w:r>
+      <w:r>
+        <w:t xml:space="preserve"> </w:t>
+      </w:r>
+      <w:r>
+        <w:t xml:space="preserve">and</w:t>
+      </w:r>
+      <w:r>
+        <w:t xml:space="preserve"> </w:t>
+      </w:r>
+      <w:r>
+        <w:t xml:space="preserve">further</w:t>
+      </w:r>
+      <w:r>
+        <w:t xml:space="preserve"> </w:t>
+      </w:r>
+      <w:r>
+        <w:t xml:space="preserve">relief</w:t>
+      </w:r>
+      <w:r>
+        <w:t xml:space="preserve"> </w:t>
+      </w:r>
+      <w:r>
+        <w:t xml:space="preserve">as</w:t>
+      </w:r>
+      <w:r>
+        <w:t xml:space="preserve"> </w:t>
+      </w:r>
+      <w:r>
+        <w:t xml:space="preserve">the</w:t>
+      </w:r>
+      <w:r>
+        <w:t xml:space="preserve"> </w:t>
+      </w:r>
+      <w:r>
+        <w:t xml:space="preserve">Court</w:t>
+      </w:r>
+      <w:r>
+        <w:t xml:space="preserve"> </w:t>
+      </w:r>
+      <w:r>
+        <w:t xml:space="preserve">deems</w:t>
+      </w:r>
+      <w:r>
+        <w:t xml:space="preserve"> </w:t>
+      </w:r>
+      <w:r>
+        <w:t xml:space="preserve">just</w:t>
+      </w:r>
+      <w:r>
+        <w:t xml:space="preserve"> </w:t>
+      </w:r>
+      <w:r>
+        <w:t xml:space="preserve">and</w:t>
+      </w:r>
+      <w:r>
+        <w:t xml:space="preserve"> </w:t>
+      </w:r>
+      <w:r>
+        <w:t xml:space="preserve">proper.</w:t>
+      </w:r>
+    </w:p>
     <w:p>
       <w:pPr>
         <w:pStyle w:val="Heading1"/>
@@ -1249,166 +1921,275 @@
     <w:p>
       <w:pPr>
         <w:keepNext/>
-        <w:spacing w:before="0" w:after="0" w:line="324" w:lineRule="exact"/>
-      </w:pPr>
+        <w:keepLines/>
+        <w:spacing w:before="324" w:after="0" w:line="276" w:lineRule="exact"/>
+        <w:ind w:left="0" w:firstLine="0"/>
+      </w:pPr>
+      <w:r>
+        <w:t xml:space="preserve">Dated: </w:t>
+      </w:r>
+      <w:r>
+        <w:t xml:space="preserve">June</w:t>
+      </w:r>
+      <w:r>
+        <w:t xml:space="preserve"> </w:t>
+      </w:r>
+      <w:r>
+        <w:t xml:space="preserve">11,</w:t>
+      </w:r>
+      <w:r>
+        <w:t xml:space="preserve"> </w:t>
+      </w:r>
+      <w:r>
+        <w:t xml:space="preserve">2026</w:t>
+      </w:r>
     </w:p>
     <w:p>
       <w:pPr>
         <w:keepNext/>
-        <w:spacing w:before="0" w:after="0" w:line="276" w:lineRule="exact"/>
-      </w:pPr>
-      <w:r>
-        <w:t xml:space="preserve">Dated: June 11, 2026</w:t>
+        <w:keepLines/>
+        <w:spacing w:before="324" w:after="0" w:line="276" w:lineRule="exact"/>
+        <w:ind w:left="4320" w:firstLine="0"/>
+      </w:pPr>
+      <w:r>
+        <w:t xml:space="preserve">Respectfully submitted,</w:t>
       </w:r>
     </w:p>
     <w:p>
       <w:pPr>
         <w:keepNext/>
-        <w:spacing w:before="0" w:after="0" w:line="324" w:lineRule="exact"/>
-      </w:pPr>
+        <w:keepLines/>
+        <w:spacing w:before="162" w:after="0" w:line="276" w:lineRule="exact"/>
+        <w:ind w:left="4320" w:firstLine="0"/>
+      </w:pPr>
+      <w:r>
+        <w:t xml:space="preserve">ZARLEYCONLEY</w:t>
+      </w:r>
+      <w:r>
+        <w:t xml:space="preserve"> </w:t>
+      </w:r>
+      <w:r>
+        <w:t xml:space="preserve">PLC</w:t>
+      </w:r>
     </w:p>
     <w:p>
       <w:pPr>
         <w:keepNext/>
+        <w:keepLines/>
+        <w:spacing w:before="162" w:after="0" w:line="276" w:lineRule="exact"/>
+        <w:ind w:left="4320" w:firstLine="0"/>
+      </w:pPr>
+      <w:r>
+        <w:t xml:space="preserve">By: /s/ Joshua J. Conley</w:t>
+      </w:r>
+    </w:p>
+    <w:p>
+      <w:pPr>
+        <w:keepNext/>
+        <w:keepLines/>
         <w:spacing w:before="0" w:after="0" w:line="276" w:lineRule="exact"/>
         <w:ind w:left="4320" w:firstLine="0"/>
       </w:pPr>
       <w:r>
-        <w:t xml:space="preserve">Respectfully submitted,</w:t>
+        <w:t xml:space="preserve">Joshua J. Conley</w:t>
       </w:r>
     </w:p>
     <w:p>
       <w:pPr>
         <w:keepNext/>
-        <w:spacing w:before="0" w:after="0" w:line="162" w:lineRule="exact"/>
-      </w:pPr>
-    </w:p>
-    <w:p>
-      <w:pPr>
-        <w:keepNext/>
+        <w:keepLines/>
         <w:spacing w:before="0" w:after="0" w:line="276" w:lineRule="exact"/>
         <w:ind w:left="4320" w:firstLine="0"/>
       </w:pPr>
       <w:r>
-        <w:t xml:space="preserve">ZARLEYCONLEY PLC</w:t>
+        <w:t xml:space="preserve">AT0011828</w:t>
       </w:r>
     </w:p>
     <w:p>
       <w:pPr>
         <w:keepNext/>
-        <w:spacing w:before="0" w:after="0" w:line="162" w:lineRule="exact"/>
-      </w:pPr>
-    </w:p>
-    <w:p>
-      <w:pPr>
-        <w:keepNext/>
+        <w:keepLines/>
         <w:spacing w:before="0" w:after="0" w:line="276" w:lineRule="exact"/>
         <w:ind w:left="4320" w:firstLine="0"/>
       </w:pPr>
       <w:r>
-        <w:t xml:space="preserve">By: /s/ Joshua J. Conley</w:t>
+        <w:t xml:space="preserve">John</w:t>
+      </w:r>
+      <w:r>
+        <w:t xml:space="preserve"> </w:t>
+      </w:r>
+      <w:r>
+        <w:t xml:space="preserve">D.</w:t>
+      </w:r>
+      <w:r>
+        <w:t xml:space="preserve"> </w:t>
+      </w:r>
+      <w:r>
+        <w:t xml:space="preserve">Gilbertson,</w:t>
+      </w:r>
+      <w:r>
+        <w:t xml:space="preserve"> </w:t>
+      </w:r>
+      <w:r>
+        <w:t xml:space="preserve">AT0014515</w:t>
       </w:r>
     </w:p>
     <w:p>
       <w:pPr>
         <w:keepNext/>
+        <w:keepLines/>
         <w:spacing w:before="0" w:after="0" w:line="276" w:lineRule="exact"/>
         <w:ind w:left="4320" w:firstLine="0"/>
       </w:pPr>
       <w:r>
-        <w:t xml:space="preserve">Joshua J. Conley</w:t>
+        <w:t xml:space="preserve">580</w:t>
+      </w:r>
+      <w:r>
+        <w:t xml:space="preserve"> </w:t>
+      </w:r>
+      <w:r>
+        <w:t xml:space="preserve">Market</w:t>
+      </w:r>
+      <w:r>
+        <w:t xml:space="preserve"> </w:t>
+      </w:r>
+      <w:r>
+        <w:t xml:space="preserve">Street,</w:t>
+      </w:r>
+      <w:r>
+        <w:t xml:space="preserve"> </w:t>
+      </w:r>
+      <w:r>
+        <w:t xml:space="preserve">Suite</w:t>
+      </w:r>
+      <w:r>
+        <w:t xml:space="preserve"> </w:t>
+      </w:r>
+      <w:r>
+        <w:t xml:space="preserve">101</w:t>
       </w:r>
     </w:p>
     <w:p>
       <w:pPr>
         <w:keepNext/>
+        <w:keepLines/>
         <w:spacing w:before="0" w:after="0" w:line="276" w:lineRule="exact"/>
         <w:ind w:left="4320" w:firstLine="0"/>
       </w:pPr>
       <w:r>
-        <w:t xml:space="preserve">AT0011828</w:t>
+        <w:t xml:space="preserve">West</w:t>
+      </w:r>
+      <w:r>
+        <w:t xml:space="preserve"> </w:t>
+      </w:r>
+      <w:r>
+        <w:t xml:space="preserve">Des</w:t>
+      </w:r>
+      <w:r>
+        <w:t xml:space="preserve"> </w:t>
+      </w:r>
+      <w:r>
+        <w:t xml:space="preserve">Moines,</w:t>
+      </w:r>
+      <w:r>
+        <w:t xml:space="preserve"> </w:t>
+      </w:r>
+      <w:r>
+        <w:t xml:space="preserve">IA</w:t>
+      </w:r>
+      <w:r>
+        <w:t xml:space="preserve"> </w:t>
+      </w:r>
+      <w:r>
+        <w:t xml:space="preserve">50266</w:t>
       </w:r>
     </w:p>
     <w:p>
       <w:pPr>
         <w:keepNext/>
+        <w:keepLines/>
         <w:spacing w:before="0" w:after="0" w:line="276" w:lineRule="exact"/>
         <w:ind w:left="4320" w:firstLine="0"/>
       </w:pPr>
       <w:r>
-        <w:t xml:space="preserve">John D. Gilbertson, AT0014515</w:t>
+        <w:t xml:space="preserve">Telephone:</w:t>
+      </w:r>
+      <w:r>
+        <w:t xml:space="preserve"> </w:t>
+      </w:r>
+      <w:r>
+        <w:t xml:space="preserve">(515)</w:t>
+      </w:r>
+      <w:r>
+        <w:t xml:space="preserve"> </w:t>
+      </w:r>
+      <w:r>
+        <w:t xml:space="preserve">558</w:t>
+        <w:noBreakHyphen/>
+        <w:t xml:space="preserve">0200</w:t>
       </w:r>
     </w:p>
     <w:p>
       <w:pPr>
         <w:keepNext/>
+        <w:keepLines/>
         <w:spacing w:before="0" w:after="0" w:line="276" w:lineRule="exact"/>
         <w:ind w:left="4320" w:firstLine="0"/>
       </w:pPr>
       <w:r>
-        <w:t xml:space="preserve">580 Market Street, Suite 101</w:t>
+        <w:t xml:space="preserve">Facsimile:</w:t>
+      </w:r>
+      <w:r>
+        <w:t xml:space="preserve"> </w:t>
+      </w:r>
+      <w:r>
+        <w:t xml:space="preserve">(515)</w:t>
+      </w:r>
+      <w:r>
+        <w:t xml:space="preserve"> </w:t>
+      </w:r>
+      <w:r>
+        <w:t xml:space="preserve">558</w:t>
+        <w:noBreakHyphen/>
+        <w:t xml:space="preserve">7790</w:t>
       </w:r>
     </w:p>
     <w:p>
       <w:pPr>
         <w:keepNext/>
+        <w:keepLines/>
         <w:spacing w:before="0" w:after="0" w:line="276" w:lineRule="exact"/>
         <w:ind w:left="4320" w:firstLine="0"/>
       </w:pPr>
       <w:r>
-        <w:t xml:space="preserve">West Des Moines, IA 50266</w:t>
-      </w:r>
-    </w:p>
-    <w:p>
-      <w:pPr>
-        <w:keepNext/>
-        <w:spacing w:before="0" w:after="0" w:line="276" w:lineRule="exact"/>
+        <w:t xml:space="preserve">jconley@zarleyconley.com</w:t>
+      </w:r>
+    </w:p>
+    <w:p>
+      <w:pPr>
+        <w:spacing w:before="0" w:after="324" w:line="276" w:lineRule="exact"/>
         <w:ind w:left="4320" w:firstLine="0"/>
       </w:pPr>
       <w:r>
-        <w:t xml:space="preserve">Telephone: (515) 558-0200</w:t>
-      </w:r>
-    </w:p>
-    <w:p>
-      <w:pPr>
-        <w:keepNext/>
-        <w:spacing w:before="0" w:after="0" w:line="276" w:lineRule="exact"/>
-        <w:ind w:left="4320" w:firstLine="0"/>
-      </w:pPr>
-      <w:r>
-        <w:t xml:space="preserve">Facsimile: (515) 558-7790</w:t>
-      </w:r>
-    </w:p>
-    <w:p>
-      <w:pPr>
-        <w:keepNext/>
-        <w:spacing w:before="0" w:after="0" w:line="276" w:lineRule="exact"/>
-        <w:ind w:left="4320" w:firstLine="0"/>
-      </w:pPr>
-      <w:r>
-        <w:t xml:space="preserve">jconley@zarleyconley.com</w:t>
-      </w:r>
-    </w:p>
-    <w:p>
-      <w:pPr>
-        <w:keepNext/>
-        <w:spacing w:before="0" w:after="0" w:line="276" w:lineRule="exact"/>
-        <w:ind w:left="4320" w:firstLine="0"/>
-      </w:pPr>
-      <w:r>
-        <w:t xml:space="preserve">ATTORNEYS FOR PLAINTIFF</w:t>
-      </w:r>
-    </w:p>
-    <w:p>
-      <w:pPr>
-        <w:spacing w:before="0" w:after="0" w:line="324" w:lineRule="exact"/>
-      </w:pPr>
-    </w:p>
-    <w:bookmarkEnd w:id="28"/>
+        <w:t xml:space="preserve">ATTORNEYS</w:t>
+      </w:r>
+      <w:r>
+        <w:t xml:space="preserve"> </w:t>
+      </w:r>
+      <w:r>
+        <w:t xml:space="preserve">FOR</w:t>
+      </w:r>
+      <w:r>
+        <w:t xml:space="preserve"> </w:t>
+      </w:r>
+      <w:r>
+        <w:t xml:space="preserve">PLAINTIFF</w:t>
+      </w:r>
+    </w:p>
     <w:sectPr>
-      <w:footerReference r:id="rId9" w:type="default"/>
-      <w:pgSz w:h="15840" w:w="12240"/>
-      <w:pgMar w:bottom="1440" w:footer="720" w:gutter="0" w:header="720" w:left="1440" w:right="1440" w:top="1440"/>
+      <w:footerReference w:type="default" r:id="rIdFooter1"/>
+      <w:pgSz w:w="12240" w:h="15840"/>
+      <w:pgMar w:top="1440" w:right="1440" w:bottom="1440" w:left="1440" w:header="720" w:footer="432" w:gutter="0"/>
     </w:sectPr>
   </w:body>
 </w:document>
@@ -1422,42 +2203,21 @@
 <w:ftr xmlns:w="http://schemas.openxmlformats.org/wordprocessingml/2006/main" xmlns:r="http://schemas.openxmlformats.org/officeDocument/2006/relationships">
   <w:p>
     <w:pPr>
-      <w:spacing w:before="0" w:after="0" w:line="276" w:lineRule="exact"/>
       <w:jc w:val="center"/>
     </w:pPr>
     <w:r>
-      <w:rPr>
-        <w:sz w:val="24"/>
-        <w:szCs w:val="24"/>
-      </w:rPr>
       <w:fldChar w:fldCharType="begin"/>
     </w:r>
     <w:r>
-      <w:rPr>
-        <w:sz w:val="24"/>
-        <w:szCs w:val="24"/>
-      </w:rPr>
       <w:instrText xml:space="preserve"> PAGE </w:instrText>
     </w:r>
     <w:r>
-      <w:rPr>
-        <w:sz w:val="24"/>
-        <w:szCs w:val="24"/>
-      </w:rPr>
       <w:fldChar w:fldCharType="separate"/>
     </w:r>
     <w:r>
-      <w:rPr>
-        <w:sz w:val="24"/>
-        <w:szCs w:val="24"/>
-      </w:rPr>
       <w:t>1</w:t>
     </w:r>
     <w:r>
-      <w:rPr>
-        <w:sz w:val="24"/>
-        <w:szCs w:val="24"/>
-      </w:rPr>
       <w:fldChar w:fldCharType="end"/>
     </w:r>
   </w:p>
@@ -1572,60 +2332,49 @@
   <w:docDefaults>
     <w:rPrDefault>
       <w:rPr>
-        <w:rFonts w:ascii="EB Garamond" w:cs="EB Garamond" w:eastAsia="EB Garamond" w:hAnsi="EB Garamond"/>
+        <w:rFonts w:ascii="TeX Gyre Termes" w:hAnsi="TeX Gyre Termes" w:eastAsia="TeX Gyre Termes" w:cs="TeX Gyre Termes"/>
         <w:sz w:val="24"/>
         <w:szCs w:val="24"/>
-        <w:lang w:bidi="ar-SA" w:eastAsia="en-US" w:val="en-US"/>
+        <w:lang w:val="en-US" w:eastAsia="zh-CN" w:bidi="ar-SA"/>
       </w:rPr>
     </w:rPrDefault>
     <w:pPrDefault>
       <w:pPr>
-        <w:spacing w:after="200"/>
+        <w:widowControl/>
+        <w:spacing w:after="0"/>
       </w:pPr>
     </w:pPrDefault>
   </w:docDefaults>
-  <w:latentStyles w:count="276" w:defLockedState="0" w:defQFormat="0" w:defSemiHidden="0" w:defUIPriority="0" w:defUnhideWhenUsed="0"/>
-  <w:style w:default="1" w:styleId="Normal" w:type="paragraph">
+  <w:latentStyles w:defLockedState="0" w:defUIPriority="0" w:defSemiHidden="0" w:defUnhideWhenUsed="0" w:defQFormat="0" w:count="276"/>
+  <w:style w:type="paragraph" w:default="1" w:styleId="Normal">
     <w:name w:val="Normal"/>
     <w:qFormat/>
-    <w:pPr>
-      <w:spacing w:after="0" w:before="0" w:line="276" w:lineRule="exact"/>
-    </w:pPr>
-    <w:rPr>
-      <w:rFonts w:ascii="EB Garamond" w:cs="EB Garamond" w:eastAsia="EB Garamond" w:hAnsi="EB Garamond"/>
-      <w:sz w:val="24"/>
-      <w:szCs w:val="24"/>
-    </w:rPr>
-  </w:style>
-  <w:style w:styleId="BodyText" w:type="paragraph">
+  </w:style>
+  <w:style w:type="paragraph" w:styleId="BodyText">
     <w:name w:val="Body Text"/>
     <w:basedOn w:val="Normal"/>
+    <w:link w:val="BodyTextChar"/>
     <w:qFormat/>
     <w:pPr>
-      <w:spacing w:after="0" w:before="0" w:line="480" w:lineRule="exact"/>
+      <w:spacing w:before="0" w:after="0" w:line="480" w:lineRule="exact"/>
       <w:ind w:firstLine="720"/>
     </w:pPr>
   </w:style>
-  <w:style w:styleId="FirstParagraph" w:type="paragraph">
+  <w:style w:type="paragraph" w:customStyle="1" w:styleId="FirstParagraph">
     <w:name w:val="First Paragraph"/>
     <w:basedOn w:val="BodyText"/>
     <w:next w:val="BodyText"/>
     <w:qFormat/>
-    <w:pPr>
-      <w:spacing w:after="0" w:before="0" w:line="480" w:lineRule="exact"/>
-      <w:ind w:firstLine="720"/>
-    </w:pPr>
-  </w:style>
-  <w:style w:styleId="Compact" w:type="paragraph">
+  </w:style>
+  <w:style w:type="paragraph" w:customStyle="1" w:styleId="Compact">
     <w:name w:val="Compact"/>
     <w:basedOn w:val="BodyText"/>
     <w:qFormat/>
     <w:pPr>
-      <w:spacing w:after="0" w:before="0" w:line="480" w:lineRule="exact"/>
-      <w:ind w:firstLine="0"/>
+      <w:spacing w:before="36" w:after="36"/>
     </w:pPr>
   </w:style>
-  <w:style w:styleId="Title" w:type="paragraph">
+  <w:style w:type="paragraph" w:styleId="Title">
     <w:name w:val="Title"/>
     <w:basedOn w:val="Normal"/>
     <w:next w:val="BodyText"/>
@@ -1639,24 +2388,24 @@
       <w:jc w:val="center"/>
     </w:pPr>
     <w:rPr>
-      <w:rFonts w:asciiTheme="majorHAnsi" w:cstheme="majorBidi" w:eastAsiaTheme="majorEastAsia" w:hAnsiTheme="majorHAnsi"/>
+      <w:rFonts w:asciiTheme="majorHAnsi" w:eastAsiaTheme="majorEastAsia" w:hAnsiTheme="majorHAnsi" w:cstheme="majorBidi"/>
       <w:sz w:val="56"/>
       <w:szCs w:val="56"/>
     </w:rPr>
   </w:style>
-  <w:style w:customStyle="1" w:styleId="TitleChar" w:type="character">
+  <w:style w:type="character" w:customStyle="1" w:styleId="TitleChar">
     <w:name w:val="Title Char"/>
     <w:basedOn w:val="DefaultParagraphFont"/>
     <w:link w:val="Title"/>
     <w:uiPriority w:val="10"/>
     <w:rsid w:val="00A10FD9"/>
     <w:rPr>
-      <w:rFonts w:asciiTheme="majorHAnsi" w:cstheme="majorBidi" w:eastAsiaTheme="majorEastAsia" w:hAnsiTheme="majorHAnsi"/>
+      <w:rFonts w:asciiTheme="majorHAnsi" w:eastAsiaTheme="majorEastAsia" w:hAnsiTheme="majorHAnsi" w:cstheme="majorBidi"/>
       <w:sz w:val="56"/>
       <w:szCs w:val="56"/>
     </w:rPr>
   </w:style>
-  <w:style w:styleId="Subtitle" w:type="paragraph">
+  <w:style w:type="paragraph" w:styleId="Subtitle">
     <w:name w:val="Subtitle"/>
     <w:basedOn w:val="Title"/>
     <w:next w:val="BodyText"/>
@@ -1670,27 +2419,27 @@
       </w:numPr>
     </w:pPr>
     <w:rPr>
-      <w:rFonts w:cstheme="majorBidi" w:eastAsiaTheme="majorEastAsia"/>
+      <w:rFonts w:eastAsiaTheme="majorEastAsia" w:cstheme="majorBidi"/>
       <w:spacing w:val="15"/>
       <w:sz w:val="28"/>
       <w:szCs w:val="28"/>
     </w:rPr>
   </w:style>
-  <w:style w:customStyle="1" w:styleId="SubtitleChar" w:type="character">
+  <w:style w:type="character" w:customStyle="1" w:styleId="SubtitleChar">
     <w:name w:val="Subtitle Char"/>
     <w:basedOn w:val="DefaultParagraphFont"/>
     <w:link w:val="Subtitle"/>
     <w:uiPriority w:val="11"/>
     <w:rsid w:val="00A10FD9"/>
     <w:rPr>
-      <w:rFonts w:cstheme="majorBidi" w:eastAsiaTheme="majorEastAsia"/>
-      <w:color w:themeColor="text1" w:themeTint="A6" w:val="595959"/>
+      <w:rFonts w:eastAsiaTheme="majorEastAsia" w:cstheme="majorBidi"/>
+      <w:color w:val="595959" w:themeColor="text1" w:themeTint="A6"/>
       <w:spacing w:val="15"/>
       <w:sz w:val="28"/>
       <w:szCs w:val="28"/>
     </w:rPr>
   </w:style>
-  <w:style w:customStyle="1" w:styleId="Author" w:type="paragraph">
+  <w:style w:type="paragraph" w:customStyle="1" w:styleId="Author">
     <w:name w:val="Author"/>
     <w:basedOn w:val="Title"/>
     <w:next w:val="BodyText"/>
@@ -1704,7 +2453,7 @@
       <w:szCs w:val="24"/>
     </w:rPr>
   </w:style>
-  <w:style w:styleId="Date" w:type="paragraph">
+  <w:style w:type="paragraph" w:styleId="Date">
     <w:name w:val="Date"/>
     <w:basedOn w:val="Title"/>
     <w:next w:val="BodyText"/>
@@ -1718,7 +2467,7 @@
       <w:szCs w:val="24"/>
     </w:rPr>
   </w:style>
-  <w:style w:customStyle="1" w:styleId="AbstractTitle" w:type="paragraph">
+  <w:style w:type="paragraph" w:customStyle="1" w:styleId="AbstractTitle">
     <w:name w:val="Abstract Title"/>
     <w:basedOn w:val="Normal"/>
     <w:next w:val="Abstract"/>
@@ -1726,7 +2475,7 @@
     <w:pPr>
       <w:keepNext/>
       <w:keepLines/>
-      <w:spacing w:after="0" w:before="300"/>
+      <w:spacing w:before="300" w:after="0"/>
       <w:jc w:val="center"/>
     </w:pPr>
     <w:rPr>
@@ -1735,7 +2484,7 @@
       <w:szCs w:val="20"/>
     </w:rPr>
   </w:style>
-  <w:style w:customStyle="1" w:styleId="Abstract" w:type="paragraph">
+  <w:style w:type="paragraph" w:customStyle="1" w:styleId="Abstract">
     <w:name w:val="Abstract"/>
     <w:basedOn w:val="Normal"/>
     <w:next w:val="BodyText"/>
@@ -1743,14 +2492,14 @@
     <w:pPr>
       <w:keepNext/>
       <w:keepLines/>
-      <w:spacing w:after="300" w:before="100"/>
+      <w:spacing w:before="100" w:after="300"/>
     </w:pPr>
     <w:rPr>
       <w:sz w:val="20"/>
       <w:szCs w:val="20"/>
     </w:rPr>
   </w:style>
-  <w:style w:styleId="Bibliography" w:type="paragraph">
+  <w:style w:type="paragraph" w:styleId="Bibliography">
     <w:name w:val="Bibliography"/>
     <w:basedOn w:val="Normal"/>
     <w:next w:val="Bibliography"/>
@@ -1758,7 +2507,7 @@
     <w:pPr/>
     <w:rPr/>
   </w:style>
-  <w:style w:styleId="Heading1" w:type="paragraph">
+  <w:style w:type="paragraph" w:styleId="Heading1">
     <w:name w:val="heading 1"/>
     <w:basedOn w:val="Normal"/>
     <w:next w:val="BodyText"/>
@@ -1766,7 +2515,7 @@
     <w:pPr>
       <w:keepNext/>
       <w:keepLines/>
-      <w:spacing w:after="0" w:before="0" w:line="480" w:lineRule="exact"/>
+      <w:spacing w:before="0" w:after="0" w:line="480" w:lineRule="exact"/>
       <w:ind w:firstLine="0"/>
       <w:jc w:val="center"/>
       <w:outlineLvl w:val="0"/>
@@ -1779,7 +2528,7 @@
       <w:szCs w:val="24"/>
     </w:rPr>
   </w:style>
-  <w:style w:styleId="Heading2" w:type="paragraph">
+  <w:style w:type="paragraph" w:styleId="Heading2">
     <w:name w:val="heading 2"/>
     <w:basedOn w:val="Normal"/>
     <w:next w:val="BodyText"/>
@@ -1787,7 +2536,7 @@
     <w:pPr>
       <w:keepNext/>
       <w:keepLines/>
-      <w:spacing w:after="0" w:before="0" w:line="480" w:lineRule="exact"/>
+      <w:spacing w:before="0" w:after="0" w:line="480" w:lineRule="exact"/>
       <w:ind w:firstLine="0"/>
       <w:jc w:val="center"/>
       <w:outlineLvl w:val="1"/>
@@ -1800,7 +2549,7 @@
       <w:szCs w:val="24"/>
     </w:rPr>
   </w:style>
-  <w:style w:styleId="Heading3" w:type="paragraph">
+  <w:style w:type="paragraph" w:styleId="Heading3">
     <w:name w:val="heading 3"/>
     <w:basedOn w:val="Normal"/>
     <w:next w:val="BodyText"/>
@@ -1808,7 +2557,7 @@
     <w:pPr>
       <w:keepNext/>
       <w:keepLines/>
-      <w:spacing w:after="0" w:before="0" w:line="480" w:lineRule="exact"/>
+      <w:spacing w:before="0" w:after="0" w:line="480" w:lineRule="exact"/>
       <w:ind w:firstLine="0"/>
       <w:outlineLvl w:val="2"/>
     </w:pPr>
@@ -1820,7 +2569,7 @@
       <w:szCs w:val="24"/>
     </w:rPr>
   </w:style>
-  <w:style w:styleId="Heading4" w:type="paragraph">
+  <w:style w:type="paragraph" w:styleId="Heading4">
     <w:name w:val="heading 4"/>
     <w:basedOn w:val="Normal"/>
     <w:next w:val="BodyText"/>
@@ -1833,17 +2582,21 @@
     <w:pPr>
       <w:keepNext/>
       <w:keepLines/>
-      <w:spacing w:after="40" w:before="80"/>
+      <w:spacing w:before="240" w:after="120" w:line="276" w:lineRule="exact"/>
+      <w:ind w:firstLine="0"/>
       <w:outlineLvl w:val="3"/>
     </w:pPr>
     <w:rPr>
-      <w:rFonts w:cstheme="majorBidi" w:eastAsiaTheme="majorEastAsia"/>
+      <w:rFonts w:ascii="TeX Gyre Termes" w:hAnsi="TeX Gyre Termes" w:eastAsia="TeX Gyre Termes" w:cs="TeX Gyre Termes"/>
+      <w:b/>
+      <w:bCs/>
       <w:i/>
-      <w:iCs/>
-      <w:color w:themeColor="accent1" w:themeShade="BF" w:val="0F4761"/>
-    </w:rPr>
-  </w:style>
-  <w:style w:styleId="Heading5" w:type="paragraph">
+      <w:color w:val="000000"/>
+      <w:sz w:val="24"/>
+      <w:szCs w:val="24"/>
+    </w:rPr>
+  </w:style>
+  <w:style w:type="paragraph" w:styleId="Heading5">
     <w:name w:val="heading 5"/>
     <w:basedOn w:val="Normal"/>
     <w:next w:val="BodyText"/>
@@ -1856,15 +2609,21 @@
     <w:pPr>
       <w:keepNext/>
       <w:keepLines/>
-      <w:spacing w:after="40" w:before="80"/>
+      <w:spacing w:before="240" w:after="120" w:line="276" w:lineRule="exact"/>
+      <w:ind w:firstLine="0"/>
       <w:outlineLvl w:val="4"/>
     </w:pPr>
     <w:rPr>
-      <w:rFonts w:cstheme="majorBidi" w:eastAsiaTheme="majorEastAsia"/>
-      <w:color w:themeColor="accent1" w:themeShade="BF" w:val="0F4761"/>
-    </w:rPr>
-  </w:style>
-  <w:style w:styleId="Heading6" w:type="paragraph">
+      <w:rFonts w:ascii="TeX Gyre Termes" w:hAnsi="TeX Gyre Termes" w:eastAsia="TeX Gyre Termes" w:cs="TeX Gyre Termes"/>
+      <w:b/>
+      <w:bCs/>
+      <w:i/>
+      <w:color w:val="000000"/>
+      <w:sz w:val="24"/>
+      <w:szCs w:val="24"/>
+    </w:rPr>
+  </w:style>
+  <w:style w:type="paragraph" w:styleId="Heading6">
     <w:name w:val="heading 6"/>
     <w:basedOn w:val="Normal"/>
     <w:next w:val="BodyText"/>
@@ -1877,17 +2636,17 @@
     <w:pPr>
       <w:keepNext/>
       <w:keepLines/>
-      <w:spacing w:after="0" w:before="40"/>
+      <w:spacing w:before="40" w:after="0"/>
       <w:outlineLvl w:val="5"/>
     </w:pPr>
     <w:rPr>
-      <w:rFonts w:cstheme="majorBidi" w:eastAsiaTheme="majorEastAsia"/>
+      <w:rFonts w:eastAsiaTheme="majorEastAsia" w:cstheme="majorBidi"/>
       <w:i/>
       <w:iCs/>
-      <w:color w:themeColor="text1" w:themeTint="A6" w:val="595959"/>
-    </w:rPr>
-  </w:style>
-  <w:style w:styleId="Heading7" w:type="paragraph">
+      <w:color w:val="595959" w:themeColor="text1" w:themeTint="A6"/>
+    </w:rPr>
+  </w:style>
+  <w:style w:type="paragraph" w:styleId="Heading7">
     <w:name w:val="heading 7"/>
     <w:basedOn w:val="Normal"/>
     <w:next w:val="BodyText"/>
@@ -1900,15 +2659,15 @@
     <w:pPr>
       <w:keepNext/>
       <w:keepLines/>
-      <w:spacing w:after="0" w:before="40"/>
+      <w:spacing w:before="40" w:after="0"/>
       <w:outlineLvl w:val="6"/>
     </w:pPr>
     <w:rPr>
-      <w:rFonts w:cstheme="majorBidi" w:eastAsiaTheme="majorEastAsia"/>
-      <w:color w:themeColor="text1" w:themeTint="A6" w:val="595959"/>
-    </w:rPr>
-  </w:style>
-  <w:style w:styleId="Heading8" w:type="paragraph">
+      <w:rFonts w:eastAsiaTheme="majorEastAsia" w:cstheme="majorBidi"/>
+      <w:color w:val="595959" w:themeColor="text1" w:themeTint="A6"/>
+    </w:rPr>
+  </w:style>
+  <w:style w:type="paragraph" w:styleId="Heading8">
     <w:name w:val="heading 8"/>
     <w:basedOn w:val="Normal"/>
     <w:next w:val="BodyText"/>
@@ -1925,13 +2684,13 @@
       <w:outlineLvl w:val="7"/>
     </w:pPr>
     <w:rPr>
-      <w:rFonts w:cstheme="majorBidi" w:eastAsiaTheme="majorEastAsia"/>
+      <w:rFonts w:eastAsiaTheme="majorEastAsia" w:cstheme="majorBidi"/>
       <w:i/>
       <w:iCs/>
-      <w:color w:themeColor="text1" w:themeTint="D8" w:val="272727"/>
-    </w:rPr>
-  </w:style>
-  <w:style w:styleId="Heading9" w:type="paragraph">
+      <w:color w:val="272727" w:themeColor="text1" w:themeTint="D8"/>
+    </w:rPr>
+  </w:style>
+  <w:style w:type="paragraph" w:styleId="Heading9">
     <w:name w:val="heading 9"/>
     <w:basedOn w:val="Normal"/>
     <w:next w:val="BodyText"/>
@@ -1948,24 +2707,24 @@
       <w:outlineLvl w:val="8"/>
     </w:pPr>
     <w:rPr>
-      <w:rFonts w:cstheme="majorBidi" w:eastAsiaTheme="majorEastAsia"/>
-      <w:color w:themeColor="text1" w:themeTint="D8" w:val="272727"/>
-    </w:rPr>
-  </w:style>
-  <w:style w:customStyle="1" w:styleId="Heading1Char" w:type="character">
+      <w:rFonts w:eastAsiaTheme="majorEastAsia" w:cstheme="majorBidi"/>
+      <w:color w:val="272727" w:themeColor="text1" w:themeTint="D8"/>
+    </w:rPr>
+  </w:style>
+  <w:style w:type="character" w:customStyle="1" w:styleId="Heading1Char">
     <w:name w:val="Heading 1 Char"/>
     <w:basedOn w:val="DefaultParagraphFont"/>
     <w:link w:val="Heading1"/>
     <w:uiPriority w:val="9"/>
     <w:rsid w:val="00A10FD9"/>
     <w:rPr>
-      <w:rFonts w:asciiTheme="majorHAnsi" w:cstheme="majorBidi" w:eastAsiaTheme="majorEastAsia" w:hAnsiTheme="majorHAnsi"/>
-      <w:color w:themeColor="accent1" w:themeShade="BF" w:val="0F4761"/>
+      <w:rFonts w:asciiTheme="majorHAnsi" w:eastAsiaTheme="majorEastAsia" w:hAnsiTheme="majorHAnsi" w:cstheme="majorBidi"/>
+      <w:color w:val="0F4761" w:themeColor="accent1" w:themeShade="BF"/>
       <w:sz w:val="40"/>
       <w:szCs w:val="40"/>
     </w:rPr>
   </w:style>
-  <w:style w:customStyle="1" w:styleId="Heading2Char" w:type="character">
+  <w:style w:type="character" w:customStyle="1" w:styleId="Heading2Char">
     <w:name w:val="Heading 2 Char"/>
     <w:basedOn w:val="DefaultParagraphFont"/>
     <w:link w:val="Heading2"/>
@@ -1973,13 +2732,13 @@
     <w:semiHidden/>
     <w:rsid w:val="00A10FD9"/>
     <w:rPr>
-      <w:rFonts w:asciiTheme="majorHAnsi" w:cstheme="majorBidi" w:eastAsiaTheme="majorEastAsia" w:hAnsiTheme="majorHAnsi"/>
-      <w:color w:themeColor="accent1" w:themeShade="BF" w:val="0F4761"/>
+      <w:rFonts w:asciiTheme="majorHAnsi" w:eastAsiaTheme="majorEastAsia" w:hAnsiTheme="majorHAnsi" w:cstheme="majorBidi"/>
+      <w:color w:val="0F4761" w:themeColor="accent1" w:themeShade="BF"/>
       <w:sz w:val="32"/>
       <w:szCs w:val="32"/>
     </w:rPr>
   </w:style>
-  <w:style w:customStyle="1" w:styleId="Heading3Char" w:type="character">
+  <w:style w:type="character" w:customStyle="1" w:styleId="Heading3Char">
     <w:name w:val="Heading 3 Char"/>
     <w:basedOn w:val="DefaultParagraphFont"/>
     <w:link w:val="Heading3"/>
@@ -1987,13 +2746,13 @@
     <w:semiHidden/>
     <w:rsid w:val="00A10FD9"/>
     <w:rPr>
-      <w:rFonts w:cstheme="majorBidi" w:eastAsiaTheme="majorEastAsia"/>
-      <w:color w:themeColor="accent1" w:themeShade="BF" w:val="0F4761"/>
+      <w:rFonts w:eastAsiaTheme="majorEastAsia" w:cstheme="majorBidi"/>
+      <w:color w:val="0F4761" w:themeColor="accent1" w:themeShade="BF"/>
       <w:sz w:val="28"/>
       <w:szCs w:val="28"/>
     </w:rPr>
   </w:style>
-  <w:style w:customStyle="1" w:styleId="Heading4Char" w:type="character">
+  <w:style w:type="character" w:customStyle="1" w:styleId="Heading4Char">
     <w:name w:val="Heading 4 Char"/>
     <w:basedOn w:val="DefaultParagraphFont"/>
     <w:link w:val="Heading4"/>
@@ -2001,13 +2760,13 @@
     <w:semiHidden/>
     <w:rsid w:val="00A10FD9"/>
     <w:rPr>
-      <w:rFonts w:cstheme="majorBidi" w:eastAsiaTheme="majorEastAsia"/>
+      <w:rFonts w:eastAsiaTheme="majorEastAsia" w:cstheme="majorBidi"/>
       <w:i/>
       <w:iCs/>
-      <w:color w:themeColor="accent1" w:themeShade="BF" w:val="0F4761"/>
-    </w:rPr>
-  </w:style>
-  <w:style w:customStyle="1" w:styleId="Heading5Char" w:type="character">
+      <w:color w:val="0F4761" w:themeColor="accent1" w:themeShade="BF"/>
+    </w:rPr>
+  </w:style>
+  <w:style w:type="character" w:customStyle="1" w:styleId="Heading5Char">
     <w:name w:val="Heading 5 Char"/>
     <w:basedOn w:val="DefaultParagraphFont"/>
     <w:link w:val="Heading5"/>
@@ -2015,11 +2774,11 @@
     <w:semiHidden/>
     <w:rsid w:val="00A10FD9"/>
     <w:rPr>
-      <w:rFonts w:cstheme="majorBidi" w:eastAsiaTheme="majorEastAsia"/>
-      <w:color w:themeColor="accent1" w:themeShade="BF" w:val="0F4761"/>
-    </w:rPr>
-  </w:style>
-  <w:style w:customStyle="1" w:styleId="Heading6Char" w:type="character">
+      <w:rFonts w:eastAsiaTheme="majorEastAsia" w:cstheme="majorBidi"/>
+      <w:color w:val="0F4761" w:themeColor="accent1" w:themeShade="BF"/>
+    </w:rPr>
+  </w:style>
+  <w:style w:type="character" w:customStyle="1" w:styleId="Heading6Char">
     <w:name w:val="Heading 6 Char"/>
     <w:basedOn w:val="DefaultParagraphFont"/>
     <w:link w:val="Heading6"/>
@@ -2027,13 +2786,13 @@
     <w:semiHidden/>
     <w:rsid w:val="00A10FD9"/>
     <w:rPr>
-      <w:rFonts w:cstheme="majorBidi" w:eastAsiaTheme="majorEastAsia"/>
+      <w:rFonts w:eastAsiaTheme="majorEastAsia" w:cstheme="majorBidi"/>
       <w:i/>
       <w:iCs/>
-      <w:color w:themeColor="text1" w:themeTint="A6" w:val="595959"/>
-    </w:rPr>
-  </w:style>
-  <w:style w:customStyle="1" w:styleId="Heading7Char" w:type="character">
+      <w:color w:val="595959" w:themeColor="text1" w:themeTint="A6"/>
+    </w:rPr>
+  </w:style>
+  <w:style w:type="character" w:customStyle="1" w:styleId="Heading7Char">
     <w:name w:val="Heading 7 Char"/>
     <w:basedOn w:val="DefaultParagraphFont"/>
     <w:link w:val="Heading7"/>
@@ -2041,11 +2800,11 @@
     <w:semiHidden/>
     <w:rsid w:val="00A10FD9"/>
     <w:rPr>
-      <w:rFonts w:cstheme="majorBidi" w:eastAsiaTheme="majorEastAsia"/>
-      <w:color w:themeColor="text1" w:themeTint="A6" w:val="595959"/>
-    </w:rPr>
-  </w:style>
-  <w:style w:customStyle="1" w:styleId="Heading8Char" w:type="character">
+      <w:rFonts w:eastAsiaTheme="majorEastAsia" w:cstheme="majorBidi"/>
+      <w:color w:val="595959" w:themeColor="text1" w:themeTint="A6"/>
+    </w:rPr>
+  </w:style>
+  <w:style w:type="character" w:customStyle="1" w:styleId="Heading8Char">
     <w:name w:val="Heading 8 Char"/>
     <w:basedOn w:val="DefaultParagraphFont"/>
     <w:link w:val="Heading8"/>
@@ -2053,13 +2812,13 @@
     <w:semiHidden/>
     <w:rsid w:val="00A10FD9"/>
     <w:rPr>
-      <w:rFonts w:cstheme="majorBidi" w:eastAsiaTheme="majorEastAsia"/>
+      <w:rFonts w:eastAsiaTheme="majorEastAsia" w:cstheme="majorBidi"/>
       <w:i/>
       <w:iCs/>
-      <w:color w:themeColor="text1" w:themeTint="D8" w:val="272727"/>
-    </w:rPr>
-  </w:style>
-  <w:style w:customStyle="1" w:styleId="Heading9Char" w:type="character">
+      <w:color w:val="272727" w:themeColor="text1" w:themeTint="D8"/>
+    </w:rPr>
+  </w:style>
+  <w:style w:type="character" w:customStyle="1" w:styleId="Heading9Char">
     <w:name w:val="Heading 9 Char"/>
     <w:basedOn w:val="DefaultParagraphFont"/>
     <w:link w:val="Heading9"/>
@@ -2067,32 +2826,48 @@
     <w:semiHidden/>
     <w:rsid w:val="00A10FD9"/>
     <w:rPr>
-      <w:rFonts w:cstheme="majorBidi" w:eastAsiaTheme="majorEastAsia"/>
-      <w:color w:themeColor="text1" w:themeTint="D8" w:val="272727"/>
-    </w:rPr>
-  </w:style>
-  <w:style w:styleId="BlockText" w:type="paragraph">
-    <w:name w:val="Block Text"/>
-    <w:basedOn w:val="Normal"/>
+      <w:rFonts w:eastAsiaTheme="majorEastAsia" w:cstheme="majorBidi"/>
+      <w:color w:val="272727" w:themeColor="text1" w:themeTint="D8"/>
+    </w:rPr>
+  </w:style>
+  <w:style w:type="paragraph" w:customStyle="1" w:styleId="ListItem">
+    <w:name w:val="List Item"/>
+    <w:basedOn w:val="BodyText"/>
     <w:qFormat/>
     <w:pPr>
-      <w:spacing w:after="240" w:before="0" w:line="276" w:lineRule="exact"/>
+      <w:spacing w:before="0" w:after="0" w:line="480" w:lineRule="exact"/>
+      <w:ind w:left="1296" w:hanging="576"/>
+    </w:pPr>
+  </w:style>
+  <w:style w:type="paragraph" w:styleId="BlockText">
+    <w:name w:val="Block Text"/>
+    <w:basedOn w:val="BodyText"/>
+    <w:next w:val="BodyText"/>
+    <w:uiPriority w:val="9"/>
+    <w:unhideWhenUsed/>
+    <w:qFormat/>
+    <w:pPr>
+      <w:spacing w:before="280" w:after="280" w:line="276" w:lineRule="exact"/>
       <w:ind w:firstLine="0" w:left="720" w:right="720"/>
     </w:pPr>
   </w:style>
-  <w:style w:styleId="FootnoteText" w:type="paragraph">
-    <w:name w:val="footnote text"/>
+  <w:style w:type="paragraph" w:styleId="FootnoteText">
+    <w:name w:val="Footnote Text"/>
     <w:basedOn w:val="Normal"/>
+    <w:next w:val="FootnoteText"/>
+    <w:uiPriority w:val="9"/>
+    <w:unhideWhenUsed/>
+    <w:qFormat/>
     <w:pPr>
-      <w:spacing w:after="120" w:before="0" w:line="276" w:lineRule="exact"/>
-      <w:ind w:firstLine="0"/>
+      <w:keepLines/>
+      <w:spacing w:before="0" w:after="140" w:line="276" w:lineRule="exact"/>
     </w:pPr>
     <w:rPr>
       <w:sz w:val="24"/>
       <w:szCs w:val="24"/>
     </w:rPr>
   </w:style>
-  <w:style w:styleId="FootnoteBlockText" w:type="paragraph">
+  <w:style w:type="paragraph" w:styleId="FootnoteBlockText">
     <w:name w:val="Footnote Block Text"/>
     <w:basedOn w:val="FootnoteText"/>
     <w:next w:val="FootnoteText"/>
@@ -2100,38 +2875,29 @@
     <w:unhideWhenUsed/>
     <w:qFormat/>
     <w:pPr>
-      <w:spacing w:after="100" w:before="100"/>
-      <w:ind w:firstLine="0" w:left="480" w:right="480"/>
+      <w:spacing w:before="280" w:after="280"/>
+      <w:ind w:firstLine="0" w:left="720" w:right="720"/>
     </w:pPr>
   </w:style>
-  <w:style w:default="1" w:styleId="DefaultParagraphFont" w:type="character">
+  <w:style w:type="character" w:default="1" w:styleId="DefaultParagraphFont">
     <w:name w:val="Default Paragraph Font"/>
     <w:semiHidden/>
     <w:unhideWhenUsed/>
   </w:style>
-  <w:style w:default="1" w:styleId="Table" w:type="table">
+  <w:style w:type="table" w:default="1" w:styleId="Table">
     <w:name w:val="Table"/>
     <w:basedOn w:val="TableNormal"/>
-    <w:semiHidden/>
-    <w:unhideWhenUsed/>
     <w:qFormat/>
     <w:tblPr>
-      <w:tblInd w:type="dxa" w:w="0"/>
+      <w:tblInd w:w="0" w:type="dxa"/>
       <w:tblCellMar>
-        <w:top w:type="dxa" w:w="0"/>
-        <w:left w:type="dxa" w:w="108"/>
-        <w:bottom w:type="dxa" w:w="0"/>
-        <w:right w:type="dxa" w:w="108"/>
+        <w:top w:w="0" w:type="dxa"/>
+        <w:left w:w="108" w:type="dxa"/>
+        <w:bottom w:w="0" w:type="dxa"/>
+        <w:right w:w="108" w:type="dxa"/>
       </w:tblCellMar>
     </w:tblPr>
     <w:tblStylePr w:type="firstRow">
-      <w:tblPr>
-        <w:jc w:val="left"/>
-        <w:tblInd w:type="dxa" w:w="0"/>
-      </w:tblPr>
-      <w:trPr>
-        <w:jc w:val="left"/>
-      </w:trPr>
       <w:tcPr>
         <w:tcBorders>
           <w:bottom w:val="single"/>
@@ -2140,7 +2906,7 @@
       </w:tcPr>
     </w:tblStylePr>
   </w:style>
-  <w:style w:customStyle="1" w:styleId="DefinitionTerm" w:type="paragraph">
+  <w:style w:type="paragraph" w:customStyle="1" w:styleId="DefinitionTerm">
     <w:name w:val="Definition Term"/>
     <w:basedOn w:val="Normal"/>
     <w:next w:val="Definition"/>
@@ -2153,49 +2919,49 @@
       <w:b/>
     </w:rPr>
   </w:style>
-  <w:style w:customStyle="1" w:styleId="Definition" w:type="paragraph">
+  <w:style w:type="paragraph" w:customStyle="1" w:styleId="Definition">
     <w:name w:val="Definition"/>
     <w:basedOn w:val="Normal"/>
   </w:style>
-  <w:style w:styleId="Caption" w:type="paragraph">
+  <w:style w:type="paragraph" w:styleId="Caption">
     <w:name w:val="Caption"/>
     <w:basedOn w:val="Normal"/>
     <w:link w:val="BodyTextChar"/>
     <w:pPr>
-      <w:spacing w:after="120" w:before="0"/>
+      <w:spacing w:before="0" w:after="120"/>
     </w:pPr>
     <w:rPr>
       <w:i/>
     </w:rPr>
   </w:style>
-  <w:style w:customStyle="1" w:styleId="TableCaption" w:type="paragraph">
+  <w:style w:type="paragraph" w:customStyle="1" w:styleId="TableCaption">
     <w:name w:val="Table Caption"/>
     <w:basedOn w:val="Caption"/>
     <w:pPr>
       <w:keepNext/>
     </w:pPr>
   </w:style>
-  <w:style w:customStyle="1" w:styleId="ImageCaption" w:type="paragraph">
+  <w:style w:type="paragraph" w:customStyle="1" w:styleId="ImageCaption">
     <w:name w:val="Image Caption"/>
     <w:basedOn w:val="Caption"/>
   </w:style>
-  <w:style w:customStyle="1" w:styleId="Figure" w:type="paragraph">
+  <w:style w:type="paragraph" w:customStyle="1" w:styleId="Figure">
     <w:name w:val="Figure"/>
     <w:basedOn w:val="Normal"/>
   </w:style>
-  <w:style w:customStyle="1" w:styleId="CaptionedFigure" w:type="paragraph">
+  <w:style w:type="paragraph" w:customStyle="1" w:styleId="CaptionedFigure">
     <w:name w:val="Captioned Figure"/>
     <w:basedOn w:val="Figure"/>
     <w:pPr>
       <w:keepNext/>
     </w:pPr>
   </w:style>
-  <w:style w:customStyle="1" w:styleId="BodyTextChar" w:type="character">
+  <w:style w:type="character" w:customStyle="1" w:styleId="BodyTextChar">
     <w:name w:val="Body Text Char"/>
     <w:basedOn w:val="DefaultParagraphFont"/>
     <w:link w:val="BodyText"/>
   </w:style>
-  <w:style w:customStyle="1" w:styleId="VerbatimChar" w:type="character">
+  <w:style w:type="character" w:customStyle="1" w:styleId="VerbatimChar">
     <w:name w:val="Verbatim Char"/>
     <w:basedOn w:val="BodyTextChar"/>
     <w:rPr>
@@ -2203,25 +2969,25 @@
       <w:sz w:val="22"/>
     </w:rPr>
   </w:style>
-  <w:style w:customStyle="1" w:styleId="SectionNumber" w:type="character">
+  <w:style w:type="character" w:customStyle="1" w:styleId="SectionNumber">
     <w:name w:val="Section Number"/>
     <w:basedOn w:val="BodyTextChar"/>
   </w:style>
-  <w:style w:styleId="FootnoteReference" w:type="character">
+  <w:style w:type="character" w:styleId="FootnoteReference">
     <w:name w:val="Footnote Reference"/>
     <w:basedOn w:val="BodyTextChar"/>
     <w:rPr>
       <w:vertAlign w:val="superscript"/>
     </w:rPr>
   </w:style>
-  <w:style w:styleId="Hyperlink" w:type="character">
+  <w:style w:type="character" w:styleId="Hyperlink">
     <w:name w:val="Hyperlink"/>
     <w:basedOn w:val="BodyTextChar"/>
     <w:rPr>
-      <w:color w:themeColor="accent1" w:val="4F81BD"/>
-    </w:rPr>
-  </w:style>
-  <w:style w:styleId="TOCHeading" w:type="paragraph">
+      <w:color w:val="000000"/>
+    </w:rPr>
+  </w:style>
+  <w:style w:type="paragraph" w:styleId="TOCHeading">
     <w:name w:val="TOC Heading"/>
     <w:basedOn w:val="Heading1"/>
     <w:next w:val="BodyText"/>
@@ -2233,63 +2999,11 @@
       <w:outlineLvl w:val="9"/>
     </w:pPr>
     <w:rPr>
-      <w:rFonts w:asciiTheme="majorHAnsi" w:cstheme="majorBidi" w:eastAsiaTheme="majorEastAsia" w:hAnsiTheme="majorHAnsi"/>
+      <w:rFonts w:asciiTheme="majorHAnsi" w:eastAsiaTheme="majorEastAsia" w:hAnsiTheme="majorHAnsi" w:cstheme="majorBidi"/>
       <w:b w:val="0"/>
       <w:bCs w:val="0"/>
-      <w:color w:themeColor="accent1" w:themeShade="BF" w:val="365F91"/>
-    </w:rPr>
-  </w:style>
-  <w:style w:customStyle="1" w:styleId="Single" w:type="paragraph">
-    <w:name w:val="Single"/>
-    <w:basedOn w:val="Normal"/>
-    <w:qFormat/>
-    <w:pPr>
-      <w:spacing w:after="0" w:before="0" w:line="276" w:lineRule="exact"/>
-      <w:ind w:firstLine="0"/>
-    </w:pPr>
-  </w:style>
-  <w:style w:customStyle="1" w:styleId="ListItem" w:type="paragraph">
-    <w:name w:val="List Item"/>
-    <w:basedOn w:val="Normal"/>
-    <w:qFormat/>
-    <w:pPr>
-      <w:spacing w:after="0" w:before="0" w:line="480" w:lineRule="exact"/>
-      <w:ind w:hanging="576" w:left="1296"/>
-    </w:pPr>
-  </w:style>
-  <w:style w:customStyle="1" w:styleId="Centered" w:type="paragraph">
-    <w:name w:val="Centered"/>
-    <w:basedOn w:val="Single"/>
-    <w:qFormat/>
-    <w:pPr>
-      <w:jc w:val="center"/>
-    </w:pPr>
-  </w:style>
-  <w:style w:styleId="TOC1" w:type="paragraph">
-    <w:name w:val="toc 1"/>
-    <w:basedOn w:val="Normal"/>
-    <w:next w:val="Normal"/>
-    <w:uiPriority w:val="39"/>
-    <w:pPr>
-      <w:tabs>
-        <w:tab w:leader="dot" w:pos="9350" w:val="right"/>
-      </w:tabs>
-      <w:spacing w:after="0" w:before="0" w:line="276" w:lineRule="exact"/>
-      <w:ind w:firstLine="0"/>
-    </w:pPr>
-  </w:style>
-  <w:style w:styleId="TOC2" w:type="paragraph">
-    <w:name w:val="toc 2"/>
-    <w:basedOn w:val="Normal"/>
-    <w:next w:val="Normal"/>
-    <w:uiPriority w:val="39"/>
-    <w:pPr>
-      <w:tabs>
-        <w:tab w:leader="dot" w:pos="9350" w:val="right"/>
-      </w:tabs>
-      <w:spacing w:after="0" w:before="0" w:line="276" w:lineRule="exact"/>
-      <w:ind w:firstLine="0" w:left="360"/>
-    </w:pPr>
+      <w:color w:val="365F91" w:themeColor="accent1" w:themeShade="BF"/>
+    </w:rPr>
   </w:style>
   <w:style w:type="paragraph" w:customStyle="1" w:styleId="SourceCode">
     <w:name w:val="Source Code"/>

</xml_diff>